<commit_message>
Update referral form to 2026-05-13 version
Co-Authored-By: Claude Opus 4.7 (1M context) <noreply@anthropic.com>
</commit_message>
<xml_diff>
--- a/assets/files/referral-form.docx
+++ b/assets/files/referral-form.docx
@@ -5,18 +5,24 @@
     <w:p>
       <w:pPr>
         <w:rPr>
+          <w:rFonts w:ascii="Calibri" w:hAnsi="Calibri" w:cs="Calibri"/>
           <w:b/>
           <w:bCs/>
-        </w:rPr>
-      </w:pPr>
-      <w:r>
-        <w:rPr>
+          <w:sz w:val="22"/>
+          <w:szCs w:val="22"/>
+        </w:rPr>
+      </w:pPr>
+      <w:r>
+        <w:rPr>
+          <w:rFonts w:ascii="Calibri" w:hAnsi="Calibri" w:cs="Calibri"/>
           <w:b/>
           <w:bCs/>
           <w:noProof/>
+          <w:sz w:val="32"/>
+          <w:szCs w:val="32"/>
         </w:rPr>
         <w:drawing>
-          <wp:anchor distT="0" distB="0" distL="114300" distR="114300" simplePos="0" relativeHeight="251658240" behindDoc="1" locked="0" layoutInCell="1" allowOverlap="1" wp14:anchorId="377F9A89" wp14:editId="5B47BE28">
+          <wp:anchor distT="0" distB="0" distL="114300" distR="114300" simplePos="0" relativeHeight="251658240" behindDoc="1" locked="0" layoutInCell="1" allowOverlap="1" wp14:anchorId="377F9A89" wp14:editId="71F8E271">
             <wp:simplePos x="0" y="0"/>
             <wp:positionH relativeFrom="column">
               <wp:posOffset>4995511</wp:posOffset>
@@ -81,28 +87,13 @@
       </w:r>
       <w:r>
         <w:rPr>
+          <w:rFonts w:ascii="Calibri" w:hAnsi="Calibri" w:cs="Calibri"/>
           <w:b/>
           <w:bCs/>
+          <w:sz w:val="32"/>
+          <w:szCs w:val="32"/>
         </w:rPr>
         <w:t>Sparrow Neuropsychology – Referral Form</w:t>
-      </w:r>
-    </w:p>
-    <w:p/>
-    <w:p>
-      <w:r>
-        <w:t xml:space="preserve">Thank you for your referral!  </w:t>
-      </w:r>
-      <w:r>
-        <w:t xml:space="preserve">Referrals can be </w:t>
-      </w:r>
-      <w:r>
-        <w:t>made</w:t>
-      </w:r>
-      <w:r>
-        <w:t xml:space="preserve"> </w:t>
-      </w:r>
-      <w:r>
-        <w:t>via:</w:t>
       </w:r>
     </w:p>
     <w:p>
@@ -110,236 +101,47 @@
         <w:tabs>
           <w:tab w:val="left" w:pos="2127"/>
         </w:tabs>
-      </w:pPr>
-      <w:r>
-        <w:rPr>
+        <w:rPr>
+          <w:rFonts w:ascii="Calibri" w:hAnsi="Calibri" w:cs="Calibri"/>
+          <w:sz w:val="22"/>
+          <w:szCs w:val="22"/>
+        </w:rPr>
+      </w:pPr>
+      <w:r>
+        <w:rPr>
+          <w:rFonts w:ascii="Calibri" w:hAnsi="Calibri" w:cs="Calibri"/>
           <w:b/>
           <w:bCs/>
+          <w:sz w:val="22"/>
+          <w:szCs w:val="22"/>
         </w:rPr>
         <w:t>Fax</w:t>
       </w:r>
       <w:r>
+        <w:rPr>
+          <w:rFonts w:ascii="Calibri" w:hAnsi="Calibri" w:cs="Calibri"/>
+          <w:sz w:val="22"/>
+          <w:szCs w:val="22"/>
+        </w:rPr>
         <w:t>:</w:t>
       </w:r>
       <w:r>
+        <w:rPr>
+          <w:rFonts w:ascii="Calibri" w:hAnsi="Calibri" w:cs="Calibri"/>
+          <w:sz w:val="22"/>
+          <w:szCs w:val="22"/>
+        </w:rPr>
         <w:tab/>
       </w:r>
       <w:r>
         <w:rPr>
+          <w:rFonts w:ascii="Calibri" w:hAnsi="Calibri" w:cs="Calibri"/>
           <w:b/>
           <w:bCs/>
+          <w:sz w:val="22"/>
+          <w:szCs w:val="22"/>
         </w:rPr>
         <w:t>(236) 259 5318</w:t>
-      </w:r>
-    </w:p>
-    <w:p>
-      <w:pPr>
-        <w:ind w:left="2127" w:hanging="2127"/>
-        <w:rPr>
-          <w:i/>
-          <w:iCs/>
-        </w:rPr>
-      </w:pPr>
-      <w:r>
-        <w:rPr>
-          <w:b/>
-          <w:bCs/>
-        </w:rPr>
-        <w:t>Secure email</w:t>
-      </w:r>
-      <w:r>
-        <w:t xml:space="preserve">: </w:t>
-      </w:r>
-      <w:r>
-        <w:tab/>
-      </w:r>
-      <w:proofErr w:type="spellStart"/>
-      <w:r>
-        <w:rPr>
-          <w:b/>
-          <w:bCs/>
-        </w:rPr>
-        <w:t>referrals@sparrow.clinic</w:t>
-      </w:r>
-      <w:proofErr w:type="spellEnd"/>
-      <w:r>
-        <w:t xml:space="preserve">  </w:t>
-      </w:r>
-      <w:r>
-        <w:rPr>
-          <w:i/>
-          <w:iCs/>
-        </w:rPr>
-        <w:t xml:space="preserve">To encrypt emails automatically, </w:t>
-      </w:r>
-      <w:r>
-        <w:rPr>
-          <w:i/>
-          <w:iCs/>
-        </w:rPr>
-        <w:t>please send from a</w:t>
-      </w:r>
-      <w:r>
-        <w:rPr>
-          <w:i/>
-          <w:iCs/>
-        </w:rPr>
-        <w:t xml:space="preserve"> </w:t>
-      </w:r>
-      <w:r>
-        <w:rPr>
-          <w:i/>
-          <w:iCs/>
-        </w:rPr>
-        <w:t xml:space="preserve">free </w:t>
-      </w:r>
-      <w:hyperlink r:id="rId8" w:history="1">
-        <w:r>
-          <w:rPr>
-            <w:rStyle w:val="Hyperlink"/>
-            <w:i/>
-            <w:iCs/>
-          </w:rPr>
-          <w:t>p</w:t>
-        </w:r>
-        <w:r>
-          <w:rPr>
-            <w:rStyle w:val="Hyperlink"/>
-            <w:i/>
-            <w:iCs/>
-          </w:rPr>
-          <w:t>roton</w:t>
-        </w:r>
-        <w:r>
-          <w:rPr>
-            <w:rStyle w:val="Hyperlink"/>
-            <w:i/>
-            <w:iCs/>
-          </w:rPr>
-          <w:t>m</w:t>
-        </w:r>
-        <w:r>
-          <w:rPr>
-            <w:rStyle w:val="Hyperlink"/>
-            <w:i/>
-            <w:iCs/>
-          </w:rPr>
-          <w:t>ail</w:t>
-        </w:r>
-        <w:r>
-          <w:rPr>
-            <w:rStyle w:val="Hyperlink"/>
-            <w:i/>
-            <w:iCs/>
-          </w:rPr>
-          <w:t>.</w:t>
-        </w:r>
-        <w:r>
-          <w:rPr>
-            <w:rStyle w:val="Hyperlink"/>
-            <w:i/>
-            <w:iCs/>
-          </w:rPr>
-          <w:t>com</w:t>
-        </w:r>
-      </w:hyperlink>
-      <w:r>
-        <w:rPr>
-          <w:i/>
-          <w:iCs/>
-        </w:rPr>
-        <w:t xml:space="preserve"> </w:t>
-      </w:r>
-      <w:r>
-        <w:rPr>
-          <w:i/>
-          <w:iCs/>
-        </w:rPr>
-        <w:t>account</w:t>
-      </w:r>
-      <w:r>
-        <w:rPr>
-          <w:i/>
-          <w:iCs/>
-        </w:rPr>
-        <w:t xml:space="preserve">.  Referrals </w:t>
-      </w:r>
-      <w:r>
-        <w:rPr>
-          <w:i/>
-          <w:iCs/>
-        </w:rPr>
-        <w:t>cannot</w:t>
-      </w:r>
-      <w:r>
-        <w:rPr>
-          <w:i/>
-          <w:iCs/>
-        </w:rPr>
-        <w:t xml:space="preserve"> </w:t>
-      </w:r>
-      <w:r>
-        <w:rPr>
-          <w:i/>
-          <w:iCs/>
-        </w:rPr>
-        <w:t xml:space="preserve">be </w:t>
-      </w:r>
-      <w:r>
-        <w:rPr>
-          <w:i/>
-          <w:iCs/>
-        </w:rPr>
-        <w:t xml:space="preserve">accepted from </w:t>
-      </w:r>
-      <w:r>
-        <w:rPr>
-          <w:i/>
-          <w:iCs/>
-        </w:rPr>
-        <w:t xml:space="preserve">non-encrypted </w:t>
-      </w:r>
-      <w:r>
-        <w:rPr>
-          <w:i/>
-          <w:iCs/>
-        </w:rPr>
-        <w:t>addresses</w:t>
-      </w:r>
-      <w:r>
-        <w:rPr>
-          <w:i/>
-          <w:iCs/>
-        </w:rPr>
-        <w:t xml:space="preserve"> (</w:t>
-      </w:r>
-      <w:r>
-        <w:rPr>
-          <w:i/>
-          <w:iCs/>
-        </w:rPr>
-        <w:t xml:space="preserve">cf. </w:t>
-      </w:r>
-      <w:r>
-        <w:rPr>
-          <w:i/>
-          <w:iCs/>
-        </w:rPr>
-        <w:t>BC privacy law</w:t>
-      </w:r>
-      <w:r>
-        <w:rPr>
-          <w:i/>
-          <w:iCs/>
-        </w:rPr>
-        <w:t>)</w:t>
-      </w:r>
-      <w:r>
-        <w:rPr>
-          <w:i/>
-          <w:iCs/>
-        </w:rPr>
-        <w:t>.</w:t>
       </w:r>
     </w:p>
     <w:p>
@@ -347,702 +149,1188 @@
         <w:tabs>
           <w:tab w:val="left" w:pos="2127"/>
         </w:tabs>
-      </w:pPr>
-      <w:r>
-        <w:rPr>
+        <w:rPr>
+          <w:rFonts w:ascii="Calibri" w:hAnsi="Calibri" w:cs="Calibri"/>
+          <w:sz w:val="22"/>
+          <w:szCs w:val="22"/>
+        </w:rPr>
+      </w:pPr>
+      <w:r>
+        <w:rPr>
+          <w:rFonts w:ascii="Calibri" w:hAnsi="Calibri" w:cs="Calibri"/>
+          <w:sz w:val="22"/>
+          <w:szCs w:val="22"/>
+        </w:rPr>
+        <w:t xml:space="preserve">Phone: </w:t>
+      </w:r>
+      <w:r>
+        <w:rPr>
+          <w:rFonts w:ascii="Calibri" w:hAnsi="Calibri" w:cs="Calibri"/>
+          <w:sz w:val="22"/>
+          <w:szCs w:val="22"/>
+        </w:rPr>
+        <w:tab/>
+        <w:t>(236) 501 5099</w:t>
+      </w:r>
+    </w:p>
+    <w:p>
+      <w:pPr>
+        <w:ind w:left="2127" w:hanging="2127"/>
+        <w:rPr>
+          <w:rFonts w:ascii="Calibri" w:hAnsi="Calibri" w:cs="Calibri"/>
+          <w:i/>
+          <w:iCs/>
+          <w:sz w:val="22"/>
+          <w:szCs w:val="22"/>
+        </w:rPr>
+      </w:pPr>
+      <w:r>
+        <w:rPr>
+          <w:rFonts w:ascii="Calibri" w:hAnsi="Calibri" w:cs="Calibri"/>
+          <w:sz w:val="22"/>
+          <w:szCs w:val="22"/>
+        </w:rPr>
+        <w:t>E</w:t>
+      </w:r>
+      <w:r>
+        <w:rPr>
+          <w:rFonts w:ascii="Calibri" w:hAnsi="Calibri" w:cs="Calibri"/>
+          <w:sz w:val="22"/>
+          <w:szCs w:val="22"/>
+        </w:rPr>
+        <w:t>mail</w:t>
+      </w:r>
+      <w:r>
+        <w:rPr>
+          <w:rFonts w:ascii="Calibri" w:hAnsi="Calibri" w:cs="Calibri"/>
+          <w:sz w:val="22"/>
+          <w:szCs w:val="22"/>
+        </w:rPr>
+        <w:t xml:space="preserve">: </w:t>
+      </w:r>
+      <w:r>
+        <w:rPr>
+          <w:rFonts w:ascii="Calibri" w:hAnsi="Calibri" w:cs="Calibri"/>
+          <w:sz w:val="22"/>
+          <w:szCs w:val="22"/>
+        </w:rPr>
+        <w:tab/>
+      </w:r>
+      <w:r>
+        <w:rPr>
+          <w:rFonts w:ascii="Calibri" w:hAnsi="Calibri" w:cs="Calibri"/>
+          <w:sz w:val="22"/>
+          <w:szCs w:val="22"/>
+        </w:rPr>
+        <w:t>clinic</w:t>
+      </w:r>
+      <w:r>
+        <w:rPr>
+          <w:rFonts w:ascii="Calibri" w:hAnsi="Calibri" w:cs="Calibri"/>
+          <w:sz w:val="22"/>
+          <w:szCs w:val="22"/>
+        </w:rPr>
+        <w:t>@sparrow.clinic</w:t>
+      </w:r>
+      <w:r>
+        <w:rPr>
+          <w:rFonts w:ascii="Calibri" w:hAnsi="Calibri" w:cs="Calibri"/>
+          <w:sz w:val="22"/>
+          <w:szCs w:val="22"/>
+        </w:rPr>
+        <w:t xml:space="preserve"> </w:t>
+      </w:r>
+    </w:p>
+    <w:p>
+      <w:pPr>
+        <w:rPr>
+          <w:rFonts w:ascii="Calibri" w:hAnsi="Calibri" w:cs="Calibri"/>
+          <w:sz w:val="22"/>
+          <w:szCs w:val="22"/>
+        </w:rPr>
+      </w:pPr>
+      <w:r>
+        <w:rPr>
+          <w:rFonts w:ascii="Calibri" w:hAnsi="Calibri" w:cs="Calibri"/>
+          <w:noProof/>
+          <w:sz w:val="22"/>
+          <w:szCs w:val="22"/>
+        </w:rPr>
+        <w:pict w14:anchorId="08CC1EC8">
+          <v:rect id="_x0000_i1026" alt="" style="width:468pt;height:.05pt;mso-width-percent:0;mso-height-percent:0;mso-width-percent:0;mso-height-percent:0" o:hralign="center" o:hrstd="t" o:hr="t" fillcolor="#a0a0a0" stroked="f"/>
+        </w:pict>
+      </w:r>
+    </w:p>
+    <w:p>
+      <w:pPr>
+        <w:spacing w:line="480" w:lineRule="auto"/>
+        <w:rPr>
+          <w:rFonts w:ascii="Calibri" w:hAnsi="Calibri" w:cs="Calibri"/>
           <w:b/>
           <w:bCs/>
-        </w:rPr>
-        <w:t>Phone:</w:t>
-      </w:r>
-      <w:r>
-        <w:t xml:space="preserve"> </w:t>
-      </w:r>
-      <w:r>
-        <w:tab/>
-      </w:r>
-      <w:r>
-        <w:rPr>
+          <w:sz w:val="11"/>
+          <w:szCs w:val="11"/>
+        </w:rPr>
+      </w:pPr>
+    </w:p>
+    <w:p>
+      <w:pPr>
+        <w:spacing w:line="480" w:lineRule="auto"/>
+        <w:rPr>
+          <w:rFonts w:ascii="Calibri" w:hAnsi="Calibri" w:cs="Calibri"/>
+          <w:sz w:val="22"/>
+          <w:szCs w:val="22"/>
+        </w:rPr>
+      </w:pPr>
+      <w:r>
+        <w:rPr>
+          <w:rFonts w:ascii="Calibri" w:hAnsi="Calibri" w:cs="Calibri"/>
           <w:b/>
           <w:bCs/>
-        </w:rPr>
-        <w:t>(236) 501 5099</w:t>
+          <w:sz w:val="22"/>
+          <w:szCs w:val="22"/>
+        </w:rPr>
+        <w:t>Referring Clinician:</w:t>
+      </w:r>
+      <w:r>
+        <w:rPr>
+          <w:rFonts w:ascii="Calibri" w:hAnsi="Calibri" w:cs="Calibri"/>
+          <w:sz w:val="22"/>
+          <w:szCs w:val="22"/>
+        </w:rPr>
+        <w:t xml:space="preserve"> </w:t>
+      </w:r>
+      <w:r>
+        <w:rPr>
+          <w:rFonts w:ascii="Calibri" w:hAnsi="Calibri" w:cs="Calibri"/>
+          <w:sz w:val="22"/>
+          <w:szCs w:val="22"/>
+        </w:rPr>
+        <w:tab/>
+      </w:r>
+      <w:r>
+        <w:rPr>
+          <w:rFonts w:ascii="Calibri" w:hAnsi="Calibri" w:cs="Calibri"/>
+          <w:sz w:val="22"/>
+          <w:szCs w:val="22"/>
+        </w:rPr>
+        <w:t>____________</w:t>
+      </w:r>
+      <w:r>
+        <w:rPr>
+          <w:rFonts w:ascii="Calibri" w:hAnsi="Calibri" w:cs="Calibri"/>
+          <w:sz w:val="22"/>
+          <w:szCs w:val="22"/>
+        </w:rPr>
+        <w:t>____________</w:t>
+      </w:r>
+      <w:r>
+        <w:rPr>
+          <w:rFonts w:ascii="Calibri" w:hAnsi="Calibri" w:cs="Calibri"/>
+          <w:sz w:val="22"/>
+          <w:szCs w:val="22"/>
+        </w:rPr>
+        <w:t>____________</w:t>
+      </w:r>
+      <w:r>
+        <w:rPr>
+          <w:rFonts w:ascii="Calibri" w:hAnsi="Calibri" w:cs="Calibri"/>
+          <w:sz w:val="22"/>
+          <w:szCs w:val="22"/>
+        </w:rPr>
+        <w:t>__________</w:t>
+      </w:r>
+      <w:r>
+        <w:rPr>
+          <w:rFonts w:ascii="Calibri" w:hAnsi="Calibri" w:cs="Calibri"/>
+          <w:sz w:val="22"/>
+          <w:szCs w:val="22"/>
+        </w:rPr>
+        <w:t>__________________</w:t>
       </w:r>
     </w:p>
     <w:p>
-      <w:r>
-        <w:rPr>
-          <w:noProof/>
-        </w:rPr>
-        <w:pict w14:anchorId="17E5A4FE">
-          <v:rect id="_x0000_i1033" alt="" style="width:468pt;height:.05pt;mso-width-percent:0;mso-height-percent:0;mso-width-percent:0;mso-height-percent:0" o:hralign="center" o:hrstd="t" o:hr="t" fillcolor="#a0a0a0" stroked="f"/>
-        </w:pict>
+      <w:pPr>
+        <w:spacing w:line="480" w:lineRule="auto"/>
+        <w:rPr>
+          <w:rFonts w:ascii="Calibri" w:hAnsi="Calibri" w:cs="Calibri"/>
+          <w:sz w:val="22"/>
+          <w:szCs w:val="22"/>
+        </w:rPr>
+      </w:pPr>
+      <w:r>
+        <w:rPr>
+          <w:rFonts w:ascii="Calibri" w:hAnsi="Calibri" w:cs="Calibri"/>
+          <w:sz w:val="22"/>
+          <w:szCs w:val="22"/>
+        </w:rPr>
+        <w:t xml:space="preserve">Practice: </w:t>
+      </w:r>
+      <w:r>
+        <w:rPr>
+          <w:rFonts w:ascii="Calibri" w:hAnsi="Calibri" w:cs="Calibri"/>
+          <w:sz w:val="22"/>
+          <w:szCs w:val="22"/>
+        </w:rPr>
+        <w:tab/>
+      </w:r>
+      <w:r>
+        <w:rPr>
+          <w:rFonts w:ascii="Calibri" w:hAnsi="Calibri" w:cs="Calibri"/>
+          <w:sz w:val="22"/>
+          <w:szCs w:val="22"/>
+        </w:rPr>
+        <w:tab/>
+        <w:t>____________</w:t>
+      </w:r>
+      <w:r>
+        <w:rPr>
+          <w:rFonts w:ascii="Calibri" w:hAnsi="Calibri" w:cs="Calibri"/>
+          <w:sz w:val="22"/>
+          <w:szCs w:val="22"/>
+        </w:rPr>
+        <w:t>____________________________________________________</w:t>
       </w:r>
     </w:p>
     <w:p>
       <w:pPr>
         <w:spacing w:line="480" w:lineRule="auto"/>
-      </w:pPr>
-      <w:r>
-        <w:rPr>
+        <w:rPr>
+          <w:rFonts w:ascii="Calibri" w:hAnsi="Calibri" w:cs="Calibri"/>
+          <w:sz w:val="22"/>
+          <w:szCs w:val="22"/>
+        </w:rPr>
+      </w:pPr>
+      <w:r>
+        <w:rPr>
+          <w:rFonts w:ascii="Calibri" w:hAnsi="Calibri" w:cs="Calibri"/>
+          <w:sz w:val="22"/>
+          <w:szCs w:val="22"/>
+        </w:rPr>
+        <w:t>Clinic p</w:t>
+      </w:r>
+      <w:r>
+        <w:rPr>
+          <w:rFonts w:ascii="Calibri" w:hAnsi="Calibri" w:cs="Calibri"/>
+          <w:sz w:val="22"/>
+          <w:szCs w:val="22"/>
+        </w:rPr>
+        <w:t xml:space="preserve">hone: </w:t>
+      </w:r>
+      <w:r>
+        <w:rPr>
+          <w:rFonts w:ascii="Calibri" w:hAnsi="Calibri" w:cs="Calibri"/>
+          <w:sz w:val="22"/>
+          <w:szCs w:val="22"/>
+        </w:rPr>
+        <w:t xml:space="preserve"> </w:t>
+      </w:r>
+      <w:r>
+        <w:rPr>
+          <w:rFonts w:ascii="Calibri" w:hAnsi="Calibri" w:cs="Calibri"/>
+          <w:sz w:val="22"/>
+          <w:szCs w:val="22"/>
+        </w:rPr>
+        <w:tab/>
+      </w:r>
+      <w:r>
+        <w:rPr>
+          <w:rFonts w:ascii="Calibri" w:hAnsi="Calibri" w:cs="Calibri"/>
+          <w:sz w:val="22"/>
+          <w:szCs w:val="22"/>
+        </w:rPr>
+        <w:tab/>
+      </w:r>
+      <w:r>
+        <w:rPr>
+          <w:rFonts w:ascii="Calibri" w:hAnsi="Calibri" w:cs="Calibri"/>
+          <w:sz w:val="22"/>
+          <w:szCs w:val="22"/>
+        </w:rPr>
+        <w:t>_____________________________</w:t>
+      </w:r>
+      <w:r>
+        <w:rPr>
+          <w:rFonts w:ascii="Calibri" w:hAnsi="Calibri" w:cs="Calibri"/>
+          <w:sz w:val="22"/>
+          <w:szCs w:val="22"/>
+        </w:rPr>
+        <w:t xml:space="preserve"> </w:t>
+      </w:r>
+      <w:r>
+        <w:rPr>
+          <w:rFonts w:ascii="Calibri" w:hAnsi="Calibri" w:cs="Calibri"/>
+          <w:sz w:val="22"/>
+          <w:szCs w:val="22"/>
+        </w:rPr>
+        <w:t xml:space="preserve">   </w:t>
+      </w:r>
+      <w:r>
+        <w:rPr>
+          <w:rFonts w:ascii="Calibri" w:hAnsi="Calibri" w:cs="Calibri"/>
+          <w:sz w:val="22"/>
+          <w:szCs w:val="22"/>
+        </w:rPr>
+        <w:tab/>
+      </w:r>
+      <w:r>
+        <w:rPr>
+          <w:rFonts w:ascii="Calibri" w:hAnsi="Calibri" w:cs="Calibri"/>
+          <w:sz w:val="22"/>
+          <w:szCs w:val="22"/>
+        </w:rPr>
+        <w:t>Clinic Fax</w:t>
+      </w:r>
+      <w:r>
+        <w:rPr>
+          <w:rFonts w:ascii="Calibri" w:hAnsi="Calibri" w:cs="Calibri"/>
+          <w:sz w:val="22"/>
+          <w:szCs w:val="22"/>
+        </w:rPr>
+        <w:t xml:space="preserve">: </w:t>
+      </w:r>
+      <w:r>
+        <w:rPr>
+          <w:rFonts w:ascii="Calibri" w:hAnsi="Calibri" w:cs="Calibri"/>
+          <w:sz w:val="22"/>
+          <w:szCs w:val="22"/>
+        </w:rPr>
+        <w:t>___</w:t>
+      </w:r>
+      <w:r>
+        <w:rPr>
+          <w:rFonts w:ascii="Calibri" w:hAnsi="Calibri" w:cs="Calibri"/>
+          <w:sz w:val="22"/>
+          <w:szCs w:val="22"/>
+        </w:rPr>
+        <w:t>_____</w:t>
+      </w:r>
+      <w:r>
+        <w:rPr>
+          <w:rFonts w:ascii="Calibri" w:hAnsi="Calibri" w:cs="Calibri"/>
+          <w:sz w:val="22"/>
+          <w:szCs w:val="22"/>
+        </w:rPr>
+        <w:t>_______________</w:t>
+      </w:r>
+    </w:p>
+    <w:p>
+      <w:pPr>
+        <w:rPr>
+          <w:rFonts w:ascii="Calibri" w:hAnsi="Calibri" w:cs="Calibri"/>
+          <w:sz w:val="22"/>
+          <w:szCs w:val="22"/>
+        </w:rPr>
+      </w:pPr>
+      <w:r>
+        <w:rPr>
+          <w:rFonts w:ascii="Calibri" w:hAnsi="Calibri" w:cs="Calibri"/>
+          <w:noProof/>
+          <w:sz w:val="22"/>
+          <w:szCs w:val="22"/>
+        </w:rPr>
+        <w:pict w14:anchorId="18172268">
+          <v:rect id="_x0000_i1025" alt="" style="width:468pt;height:.05pt;mso-width-percent:0;mso-height-percent:0;mso-width-percent:0;mso-height-percent:0" o:hralign="center" o:hrstd="t" o:hr="t" fillcolor="#a0a0a0" stroked="f"/>
+        </w:pict>
+      </w:r>
+    </w:p>
+    <w:p>
+      <w:pPr>
+        <w:spacing w:line="480" w:lineRule="auto"/>
+        <w:rPr>
+          <w:rFonts w:ascii="Calibri" w:hAnsi="Calibri" w:cs="Calibri"/>
           <w:b/>
           <w:bCs/>
-        </w:rPr>
-        <w:t>Referring Clinician:</w:t>
-      </w:r>
-      <w:r>
-        <w:t xml:space="preserve"> </w:t>
-      </w:r>
-      <w:r>
-        <w:tab/>
-      </w:r>
-      <w:r>
-        <w:tab/>
-      </w:r>
-      <w:r>
-        <w:tab/>
-      </w:r>
-      <w:r>
-        <w:t>________________________</w:t>
-      </w:r>
-      <w:r>
-        <w:t>__________</w:t>
-      </w:r>
-      <w:r>
-        <w:t>__________________</w:t>
-      </w:r>
+          <w:sz w:val="11"/>
+          <w:szCs w:val="11"/>
+        </w:rPr>
+      </w:pPr>
     </w:p>
     <w:p>
       <w:pPr>
         <w:spacing w:line="480" w:lineRule="auto"/>
-        <w:ind w:left="720"/>
-      </w:pPr>
-      <w:r>
-        <w:rPr>
+        <w:rPr>
+          <w:rFonts w:ascii="Calibri" w:hAnsi="Calibri" w:cs="Calibri"/>
           <w:b/>
           <w:bCs/>
-        </w:rPr>
-        <w:t>Clinic / Practice Name:</w:t>
-      </w:r>
-      <w:r>
+          <w:sz w:val="22"/>
+          <w:szCs w:val="22"/>
+        </w:rPr>
+      </w:pPr>
+      <w:r>
+        <w:rPr>
+          <w:rFonts w:ascii="Calibri" w:hAnsi="Calibri" w:cs="Calibri"/>
+          <w:b/>
+          <w:bCs/>
+          <w:sz w:val="22"/>
+          <w:szCs w:val="22"/>
+        </w:rPr>
+        <w:t>Patient</w:t>
+      </w:r>
+      <w:r>
+        <w:rPr>
+          <w:rFonts w:ascii="Calibri" w:hAnsi="Calibri" w:cs="Calibri"/>
+          <w:b/>
+          <w:bCs/>
+          <w:sz w:val="22"/>
+          <w:szCs w:val="22"/>
+        </w:rPr>
+        <w:t xml:space="preserve"> name</w:t>
+      </w:r>
+      <w:r>
+        <w:rPr>
+          <w:rFonts w:ascii="Calibri" w:hAnsi="Calibri" w:cs="Calibri"/>
+          <w:b/>
+          <w:bCs/>
+          <w:sz w:val="22"/>
+          <w:szCs w:val="22"/>
+        </w:rPr>
+        <w:t>:</w:t>
+      </w:r>
+      <w:r>
+        <w:rPr>
+          <w:rFonts w:ascii="Calibri" w:hAnsi="Calibri" w:cs="Calibri"/>
+          <w:b/>
+          <w:bCs/>
+          <w:sz w:val="22"/>
+          <w:szCs w:val="22"/>
+        </w:rPr>
+        <w:tab/>
+      </w:r>
+      <w:r>
+        <w:rPr>
+          <w:rFonts w:ascii="Calibri" w:hAnsi="Calibri" w:cs="Calibri"/>
+          <w:sz w:val="22"/>
+          <w:szCs w:val="22"/>
+        </w:rPr>
+        <w:t>________</w:t>
+      </w:r>
+      <w:r>
+        <w:rPr>
+          <w:rFonts w:ascii="Calibri" w:hAnsi="Calibri" w:cs="Calibri"/>
+          <w:sz w:val="22"/>
+          <w:szCs w:val="22"/>
+        </w:rPr>
+        <w:t>____________________</w:t>
+      </w:r>
+      <w:r>
+        <w:rPr>
+          <w:rFonts w:ascii="Calibri" w:hAnsi="Calibri" w:cs="Calibri"/>
+          <w:sz w:val="22"/>
+          <w:szCs w:val="22"/>
+        </w:rPr>
+        <w:t>_____</w:t>
+      </w:r>
+      <w:r>
+        <w:rPr>
+          <w:rFonts w:ascii="Calibri" w:hAnsi="Calibri" w:cs="Calibri"/>
+          <w:sz w:val="22"/>
+          <w:szCs w:val="22"/>
+        </w:rPr>
+        <w:t>___</w:t>
+      </w:r>
+      <w:r>
+        <w:rPr>
+          <w:rFonts w:ascii="Calibri" w:hAnsi="Calibri" w:cs="Calibri"/>
+          <w:sz w:val="22"/>
+          <w:szCs w:val="22"/>
+        </w:rPr>
+        <w:tab/>
+        <w:t xml:space="preserve">   </w:t>
+      </w:r>
+      <w:r>
+        <w:rPr>
+          <w:rFonts w:ascii="Calibri" w:hAnsi="Calibri" w:cs="Calibri"/>
+          <w:sz w:val="22"/>
+          <w:szCs w:val="22"/>
+        </w:rPr>
+        <w:t>Date of birth:</w:t>
+      </w:r>
+      <w:r>
+        <w:rPr>
+          <w:rFonts w:ascii="Calibri" w:hAnsi="Calibri" w:cs="Calibri"/>
+          <w:sz w:val="22"/>
+          <w:szCs w:val="22"/>
+        </w:rPr>
         <w:t xml:space="preserve"> </w:t>
       </w:r>
       <w:r>
-        <w:tab/>
-      </w:r>
-      <w:r>
-        <w:t>________________________</w:t>
-      </w:r>
-      <w:r>
-        <w:t>__________</w:t>
-      </w:r>
-      <w:r>
-        <w:t>__________________</w:t>
+        <w:rPr>
+          <w:rFonts w:ascii="Calibri" w:hAnsi="Calibri" w:cs="Calibri"/>
+          <w:sz w:val="22"/>
+          <w:szCs w:val="22"/>
+        </w:rPr>
+        <w:t xml:space="preserve"> </w:t>
+      </w:r>
+      <w:r>
+        <w:rPr>
+          <w:rFonts w:ascii="Calibri" w:hAnsi="Calibri" w:cs="Calibri"/>
+          <w:sz w:val="22"/>
+          <w:szCs w:val="22"/>
+        </w:rPr>
+        <w:t>___________________</w:t>
       </w:r>
     </w:p>
     <w:p>
       <w:pPr>
         <w:spacing w:line="480" w:lineRule="auto"/>
-        <w:ind w:left="720"/>
-      </w:pPr>
-      <w:r>
-        <w:rPr>
+        <w:rPr>
+          <w:rFonts w:ascii="Calibri" w:hAnsi="Calibri" w:cs="Calibri"/>
+          <w:sz w:val="22"/>
+          <w:szCs w:val="22"/>
+        </w:rPr>
+      </w:pPr>
+      <w:r>
+        <w:rPr>
+          <w:rFonts w:ascii="Calibri" w:hAnsi="Calibri" w:cs="Calibri"/>
+          <w:sz w:val="22"/>
+          <w:szCs w:val="22"/>
+        </w:rPr>
+        <w:t>Patient phone</w:t>
+      </w:r>
+      <w:r>
+        <w:rPr>
+          <w:rFonts w:ascii="Calibri" w:hAnsi="Calibri" w:cs="Calibri"/>
+          <w:sz w:val="22"/>
+          <w:szCs w:val="22"/>
+        </w:rPr>
+        <w:t>:</w:t>
+      </w:r>
+      <w:r>
+        <w:rPr>
+          <w:rFonts w:ascii="Calibri" w:hAnsi="Calibri" w:cs="Calibri"/>
+          <w:sz w:val="22"/>
+          <w:szCs w:val="22"/>
+        </w:rPr>
+        <w:tab/>
+        <w:t>_</w:t>
+      </w:r>
+      <w:r>
+        <w:rPr>
+          <w:rFonts w:ascii="Calibri" w:hAnsi="Calibri" w:cs="Calibri"/>
+          <w:sz w:val="22"/>
+          <w:szCs w:val="22"/>
+        </w:rPr>
+        <w:t>_________</w:t>
+      </w:r>
+      <w:r>
+        <w:rPr>
+          <w:rFonts w:ascii="Calibri" w:hAnsi="Calibri" w:cs="Calibri"/>
+          <w:sz w:val="22"/>
+          <w:szCs w:val="22"/>
+        </w:rPr>
+        <w:t>___________</w:t>
+      </w:r>
+      <w:r>
+        <w:rPr>
+          <w:rFonts w:ascii="Calibri" w:hAnsi="Calibri" w:cs="Calibri"/>
+          <w:sz w:val="22"/>
+          <w:szCs w:val="22"/>
+        </w:rPr>
+        <w:tab/>
+        <w:t>E</w:t>
+      </w:r>
+      <w:r>
+        <w:rPr>
+          <w:rFonts w:ascii="Calibri" w:hAnsi="Calibri" w:cs="Calibri"/>
+          <w:sz w:val="22"/>
+          <w:szCs w:val="22"/>
+        </w:rPr>
+        <w:t>mail</w:t>
+      </w:r>
+      <w:r>
+        <w:rPr>
+          <w:rFonts w:ascii="Calibri" w:hAnsi="Calibri" w:cs="Calibri"/>
+          <w:sz w:val="22"/>
+          <w:szCs w:val="22"/>
+        </w:rPr>
+        <w:t xml:space="preserve">: </w:t>
+      </w:r>
+      <w:r>
+        <w:rPr>
+          <w:rFonts w:ascii="Calibri" w:hAnsi="Calibri" w:cs="Calibri"/>
+          <w:sz w:val="22"/>
+          <w:szCs w:val="22"/>
+        </w:rPr>
+        <w:t>_</w:t>
+      </w:r>
+      <w:r>
+        <w:rPr>
+          <w:rFonts w:ascii="Calibri" w:hAnsi="Calibri" w:cs="Calibri"/>
+          <w:sz w:val="22"/>
+          <w:szCs w:val="22"/>
+        </w:rPr>
+        <w:t>______________</w:t>
+      </w:r>
+      <w:r>
+        <w:rPr>
+          <w:rFonts w:ascii="Calibri" w:hAnsi="Calibri" w:cs="Calibri"/>
+          <w:sz w:val="22"/>
+          <w:szCs w:val="22"/>
+        </w:rPr>
+        <w:t>___</w:t>
+      </w:r>
+      <w:r>
+        <w:rPr>
+          <w:rFonts w:ascii="Calibri" w:hAnsi="Calibri" w:cs="Calibri"/>
+          <w:sz w:val="22"/>
+          <w:szCs w:val="22"/>
+        </w:rPr>
+        <w:t>___________</w:t>
+      </w:r>
+      <w:r>
+        <w:rPr>
+          <w:rFonts w:ascii="Calibri" w:hAnsi="Calibri" w:cs="Calibri"/>
+          <w:sz w:val="22"/>
+          <w:szCs w:val="22"/>
+        </w:rPr>
+        <w:t>___________</w:t>
+      </w:r>
+    </w:p>
+    <w:p>
+      <w:pPr>
+        <w:spacing w:line="480" w:lineRule="auto"/>
+        <w:rPr>
+          <w:rFonts w:ascii="Calibri" w:hAnsi="Calibri" w:cs="Calibri"/>
           <w:b/>
           <w:bCs/>
-        </w:rPr>
-        <w:t>Clinic p</w:t>
-      </w:r>
-      <w:r>
-        <w:rPr>
+          <w:sz w:val="22"/>
+          <w:szCs w:val="22"/>
+        </w:rPr>
+      </w:pPr>
+      <w:r>
+        <w:rPr>
+          <w:rFonts w:ascii="Calibri" w:hAnsi="Calibri" w:cs="Calibri"/>
+          <w:sz w:val="22"/>
+          <w:szCs w:val="22"/>
+        </w:rPr>
+        <w:t>Primary language:</w:t>
+      </w:r>
+      <w:r>
+        <w:rPr>
+          <w:rFonts w:ascii="Calibri" w:hAnsi="Calibri" w:cs="Calibri"/>
           <w:b/>
           <w:bCs/>
-        </w:rPr>
-        <w:t>hone:</w:t>
-      </w:r>
-      <w:r>
-        <w:t xml:space="preserve"> </w:t>
-      </w:r>
-      <w:r>
-        <w:t xml:space="preserve"> </w:t>
-      </w:r>
-      <w:r>
+          <w:sz w:val="22"/>
+          <w:szCs w:val="22"/>
+        </w:rPr>
         <w:tab/>
       </w:r>
       <w:r>
-        <w:tab/>
-      </w:r>
-      <w:r>
-        <w:t>________________________</w:t>
-      </w:r>
-      <w:r>
-        <w:t>_____</w:t>
-      </w:r>
-      <w:r>
-        <w:t xml:space="preserve"> </w:t>
-      </w:r>
-      <w:r>
-        <w:rPr>
+        <w:rPr>
+          <w:rFonts w:ascii="Calibri" w:hAnsi="Calibri" w:cs="Calibri"/>
           <w:b/>
           <w:bCs/>
-        </w:rPr>
-        <w:t>Fax</w:t>
-      </w:r>
-      <w:r>
-        <w:t xml:space="preserve">: </w:t>
-      </w:r>
-      <w:r>
-        <w:t>__________________</w:t>
+          <w:sz w:val="22"/>
+          <w:szCs w:val="22"/>
+        </w:rPr>
+        <w:t>__</w:t>
+      </w:r>
+      <w:r>
+        <w:rPr>
+          <w:rFonts w:ascii="Calibri" w:hAnsi="Calibri" w:cs="Calibri"/>
+          <w:sz w:val="22"/>
+          <w:szCs w:val="22"/>
+        </w:rPr>
+        <w:t>_______________________________________________________________</w:t>
       </w:r>
     </w:p>
     <w:p>
       <w:pPr>
-        <w:ind w:left="720"/>
-      </w:pPr>
-      <w:r>
-        <w:rPr>
+        <w:spacing w:line="480" w:lineRule="auto"/>
+        <w:rPr>
+          <w:rFonts w:ascii="Calibri" w:hAnsi="Calibri" w:cs="Calibri"/>
+          <w:sz w:val="22"/>
+          <w:szCs w:val="22"/>
+        </w:rPr>
+      </w:pPr>
+      <w:r>
+        <w:rPr>
+          <w:rFonts w:ascii="Calibri" w:hAnsi="Calibri" w:cs="Calibri"/>
+          <w:sz w:val="22"/>
+          <w:szCs w:val="22"/>
+        </w:rPr>
+        <w:t>Referral question</w:t>
+      </w:r>
+      <w:r>
+        <w:rPr>
+          <w:rFonts w:ascii="Calibri" w:hAnsi="Calibri" w:cs="Calibri"/>
+          <w:sz w:val="22"/>
+          <w:szCs w:val="22"/>
+        </w:rPr>
+        <w:t xml:space="preserve">: </w:t>
+      </w:r>
+      <w:r>
+        <w:rPr>
+          <w:rFonts w:ascii="Calibri" w:hAnsi="Calibri" w:cs="Calibri"/>
+          <w:sz w:val="22"/>
+          <w:szCs w:val="22"/>
+        </w:rPr>
+        <w:tab/>
+      </w:r>
+      <w:r>
+        <w:rPr>
+          <w:rFonts w:ascii="Calibri" w:hAnsi="Calibri" w:cs="Calibri"/>
+          <w:sz w:val="22"/>
+          <w:szCs w:val="22"/>
+        </w:rPr>
+        <w:t>_</w:t>
+      </w:r>
+      <w:r>
+        <w:rPr>
+          <w:rFonts w:ascii="Calibri" w:hAnsi="Calibri" w:cs="Calibri"/>
+          <w:sz w:val="22"/>
+          <w:szCs w:val="22"/>
+        </w:rPr>
+        <w:t>____</w:t>
+      </w:r>
+      <w:r>
+        <w:rPr>
+          <w:rFonts w:ascii="Calibri" w:hAnsi="Calibri" w:cs="Calibri"/>
+          <w:sz w:val="22"/>
+          <w:szCs w:val="22"/>
+        </w:rPr>
+        <w:t>______________________</w:t>
+      </w:r>
+      <w:r>
+        <w:rPr>
+          <w:rFonts w:ascii="Calibri" w:hAnsi="Calibri" w:cs="Calibri"/>
+          <w:sz w:val="22"/>
+          <w:szCs w:val="22"/>
+        </w:rPr>
+        <w:t>______________________________________</w:t>
+      </w:r>
+    </w:p>
+    <w:p>
+      <w:pPr>
+        <w:spacing w:line="480" w:lineRule="auto"/>
+        <w:rPr>
+          <w:rFonts w:ascii="Calibri" w:hAnsi="Calibri" w:cs="Calibri"/>
+          <w:sz w:val="22"/>
+          <w:szCs w:val="22"/>
+        </w:rPr>
+      </w:pPr>
+      <w:r>
+        <w:rPr>
+          <w:rFonts w:ascii="Calibri" w:hAnsi="Calibri" w:cs="Calibri"/>
+          <w:sz w:val="22"/>
+          <w:szCs w:val="22"/>
+        </w:rPr>
+        <w:t>_____________________________________________________________________________________</w:t>
+      </w:r>
+    </w:p>
+    <w:p>
+      <w:pPr>
+        <w:spacing w:line="480" w:lineRule="auto"/>
+        <w:rPr>
+          <w:rFonts w:ascii="Calibri" w:hAnsi="Calibri" w:cs="Calibri"/>
+          <w:sz w:val="22"/>
+          <w:szCs w:val="22"/>
+        </w:rPr>
+      </w:pPr>
+      <w:r>
+        <w:rPr>
+          <w:rFonts w:ascii="Calibri" w:hAnsi="Calibri" w:cs="Calibri"/>
+          <w:sz w:val="22"/>
+          <w:szCs w:val="22"/>
+        </w:rPr>
+        <w:t>_____________________________________________________________________________________</w:t>
+      </w:r>
+    </w:p>
+    <w:p>
+      <w:pPr>
+        <w:rPr>
+          <w:rFonts w:ascii="Calibri" w:hAnsi="Calibri" w:cs="Calibri"/>
+          <w:sz w:val="22"/>
+          <w:szCs w:val="22"/>
+        </w:rPr>
+      </w:pPr>
+      <w:r>
+        <w:rPr>
+          <w:rFonts w:ascii="Calibri" w:hAnsi="Calibri" w:cs="Calibri"/>
           <w:b/>
           <w:bCs/>
-        </w:rPr>
-        <w:t>Signature</w:t>
-      </w:r>
-      <w:r>
-        <w:t>:</w:t>
-      </w:r>
-      <w:r>
+          <w:sz w:val="22"/>
+          <w:szCs w:val="22"/>
+        </w:rPr>
+        <w:t>Priority</w:t>
+      </w:r>
+      <w:r>
+        <w:rPr>
+          <w:rFonts w:ascii="Calibri" w:hAnsi="Calibri" w:cs="Calibri"/>
+          <w:sz w:val="22"/>
+          <w:szCs w:val="22"/>
+        </w:rPr>
         <w:tab/>
       </w:r>
       <w:r>
+        <w:rPr>
+          <w:rFonts w:ascii="Calibri" w:hAnsi="Calibri" w:cs="Calibri"/>
+          <w:sz w:val="22"/>
+          <w:szCs w:val="22"/>
+        </w:rPr>
         <w:tab/>
       </w:r>
       <w:r>
-        <w:tab/>
-      </w:r>
-      <w:r>
-        <w:t>________________________</w:t>
-      </w:r>
-      <w:r>
-        <w:t>__________</w:t>
-      </w:r>
-      <w:r>
-        <w:t>__________________</w:t>
+        <w:rPr>
+          <w:rFonts w:ascii="Segoe UI Symbol" w:hAnsi="Segoe UI Symbol" w:cs="Segoe UI Symbol"/>
+          <w:sz w:val="22"/>
+          <w:szCs w:val="22"/>
+        </w:rPr>
+        <w:t>☐</w:t>
+      </w:r>
+      <w:r>
+        <w:rPr>
+          <w:rFonts w:ascii="Calibri" w:hAnsi="Calibri" w:cs="Calibri"/>
+          <w:sz w:val="22"/>
+          <w:szCs w:val="22"/>
+        </w:rPr>
+        <w:t xml:space="preserve"> </w:t>
+      </w:r>
+      <w:r>
+        <w:rPr>
+          <w:rFonts w:ascii="Calibri" w:hAnsi="Calibri" w:cs="Calibri"/>
+          <w:sz w:val="22"/>
+          <w:szCs w:val="22"/>
+        </w:rPr>
+        <w:t>1. Routine (next available)</w:t>
+      </w:r>
+      <w:r>
+        <w:rPr>
+          <w:rFonts w:ascii="Calibri" w:hAnsi="Calibri" w:cs="Calibri"/>
+          <w:sz w:val="22"/>
+          <w:szCs w:val="22"/>
+        </w:rPr>
+        <w:t xml:space="preserve">.   </w:t>
+      </w:r>
+      <w:r>
+        <w:rPr>
+          <w:rFonts w:ascii="Segoe UI Symbol" w:hAnsi="Segoe UI Symbol" w:cs="Segoe UI Symbol"/>
+          <w:sz w:val="22"/>
+          <w:szCs w:val="22"/>
+        </w:rPr>
+        <w:t>☐</w:t>
+      </w:r>
+      <w:r>
+        <w:rPr>
+          <w:rFonts w:ascii="Calibri" w:hAnsi="Calibri" w:cs="Calibri"/>
+          <w:sz w:val="22"/>
+          <w:szCs w:val="22"/>
+        </w:rPr>
+        <w:t xml:space="preserve"> 2. Priority (4-8 weeks).    </w:t>
+      </w:r>
+      <w:r>
+        <w:rPr>
+          <w:rFonts w:ascii="Segoe UI Symbol" w:hAnsi="Segoe UI Symbol" w:cs="Segoe UI Symbol"/>
+          <w:sz w:val="22"/>
+          <w:szCs w:val="22"/>
+        </w:rPr>
+        <w:t>☐</w:t>
+      </w:r>
+      <w:r>
+        <w:rPr>
+          <w:rFonts w:ascii="Calibri" w:hAnsi="Calibri" w:cs="Calibri"/>
+          <w:sz w:val="22"/>
+          <w:szCs w:val="22"/>
+        </w:rPr>
+        <w:t xml:space="preserve"> 3. </w:t>
+      </w:r>
+      <w:r>
+        <w:rPr>
+          <w:rFonts w:ascii="Calibri" w:hAnsi="Calibri" w:cs="Calibri"/>
+          <w:sz w:val="22"/>
+          <w:szCs w:val="22"/>
+        </w:rPr>
+        <w:t xml:space="preserve">Urgent </w:t>
+      </w:r>
+      <w:r>
+        <w:rPr>
+          <w:rFonts w:ascii="Calibri" w:hAnsi="Calibri" w:cs="Calibri"/>
+          <w:sz w:val="22"/>
+          <w:szCs w:val="22"/>
+        </w:rPr>
+        <w:t>(2-4 weeks)</w:t>
       </w:r>
     </w:p>
     <w:p>
-      <w:r>
-        <w:rPr>
-          <w:noProof/>
-        </w:rPr>
-        <w:pict w14:anchorId="2EFF71A6">
-          <v:rect id="_x0000_i1032" alt="" style="width:468pt;height:.05pt;mso-width-percent:0;mso-height-percent:0;mso-width-percent:0;mso-height-percent:0" o:hralign="center" o:hrstd="t" o:hr="t" fillcolor="#a0a0a0" stroked="f"/>
-        </w:pict>
+      <w:pPr>
+        <w:rPr>
+          <w:rFonts w:ascii="Calibri" w:hAnsi="Calibri" w:cs="Calibri"/>
+          <w:sz w:val="22"/>
+          <w:szCs w:val="22"/>
+        </w:rPr>
+      </w:pPr>
+      <w:r>
+        <w:rPr>
+          <w:rFonts w:ascii="Calibri" w:hAnsi="Calibri" w:cs="Calibri"/>
+          <w:sz w:val="8"/>
+          <w:szCs w:val="8"/>
+        </w:rPr>
+        <w:br/>
+      </w:r>
+      <w:r>
+        <w:rPr>
+          <w:rFonts w:ascii="Calibri" w:hAnsi="Calibri" w:cs="Calibri"/>
+          <w:b/>
+          <w:bCs/>
+          <w:sz w:val="22"/>
+          <w:szCs w:val="22"/>
+        </w:rPr>
+        <w:t>Reason urgent</w:t>
+      </w:r>
+      <w:r>
+        <w:rPr>
+          <w:rFonts w:ascii="Calibri" w:hAnsi="Calibri" w:cs="Calibri"/>
+          <w:sz w:val="22"/>
+          <w:szCs w:val="22"/>
+        </w:rPr>
+        <w:t xml:space="preserve">: </w:t>
+      </w:r>
+      <w:r>
+        <w:rPr>
+          <w:rFonts w:ascii="Calibri" w:hAnsi="Calibri" w:cs="Calibri"/>
+          <w:sz w:val="22"/>
+          <w:szCs w:val="22"/>
+        </w:rPr>
+        <w:tab/>
+        <w:t>________</w:t>
+      </w:r>
+      <w:r>
+        <w:rPr>
+          <w:rFonts w:ascii="Calibri" w:hAnsi="Calibri" w:cs="Calibri"/>
+          <w:sz w:val="22"/>
+          <w:szCs w:val="22"/>
+        </w:rPr>
+        <w:t>________________________________________________________________</w:t>
       </w:r>
     </w:p>
     <w:p>
       <w:pPr>
-        <w:spacing w:line="480" w:lineRule="auto"/>
-        <w:rPr>
+        <w:rPr>
+          <w:rFonts w:ascii="Calibri" w:hAnsi="Calibri" w:cs="Calibri"/>
+          <w:sz w:val="2"/>
+          <w:szCs w:val="2"/>
+        </w:rPr>
+      </w:pPr>
+    </w:p>
+    <w:p>
+      <w:pPr>
+        <w:rPr>
+          <w:rFonts w:ascii="Calibri" w:hAnsi="Calibri" w:cs="Calibri"/>
+          <w:sz w:val="22"/>
+          <w:szCs w:val="22"/>
+        </w:rPr>
+      </w:pPr>
+      <w:r>
+        <w:rPr>
+          <w:rFonts w:ascii="Calibri" w:hAnsi="Calibri" w:cs="Calibri"/>
           <w:b/>
           <w:bCs/>
-        </w:rPr>
-      </w:pPr>
-      <w:r>
-        <w:rPr>
-          <w:b/>
-          <w:bCs/>
-        </w:rPr>
-        <w:t>Patient</w:t>
-      </w:r>
-      <w:r>
-        <w:rPr>
-          <w:b/>
-          <w:bCs/>
-        </w:rPr>
-        <w:t xml:space="preserve"> name</w:t>
-      </w:r>
-      <w:r>
-        <w:rPr>
-          <w:b/>
-          <w:bCs/>
-        </w:rPr>
-        <w:t>:</w:t>
-      </w:r>
-      <w:r>
-        <w:rPr>
-          <w:b/>
-          <w:bCs/>
-        </w:rPr>
-        <w:tab/>
-      </w:r>
-      <w:r>
-        <w:t>_______________</w:t>
-      </w:r>
-      <w:r>
-        <w:t>_______________________</w:t>
-      </w:r>
-      <w:r>
-        <w:t>__________</w:t>
-      </w:r>
-      <w:r>
-        <w:t>_________________</w:t>
+          <w:sz w:val="22"/>
+          <w:szCs w:val="22"/>
+        </w:rPr>
+        <w:t>Supporting documentation</w:t>
+      </w:r>
+      <w:r>
+        <w:rPr>
+          <w:rFonts w:ascii="Calibri" w:hAnsi="Calibri" w:cs="Calibri"/>
+          <w:sz w:val="22"/>
+          <w:szCs w:val="22"/>
+        </w:rPr>
+        <w:t>.  Please attach as available –</w:t>
       </w:r>
     </w:p>
     <w:p>
       <w:pPr>
-        <w:spacing w:line="480" w:lineRule="auto"/>
-        <w:ind w:left="720"/>
-      </w:pPr>
-      <w:r>
-        <w:rPr>
-          <w:b/>
-          <w:bCs/>
-        </w:rPr>
-        <w:t>Date of Birth:</w:t>
-      </w:r>
-      <w:r>
-        <w:t xml:space="preserve"> _____________</w:t>
-      </w:r>
-      <w:r>
-        <w:t>___________</w:t>
-      </w:r>
-      <w:r>
+        <w:ind w:firstLine="720"/>
+        <w:rPr>
+          <w:rFonts w:ascii="Calibri" w:hAnsi="Calibri" w:cs="Calibri"/>
+          <w:sz w:val="22"/>
+          <w:szCs w:val="22"/>
+        </w:rPr>
+      </w:pPr>
+      <w:r>
+        <w:rPr>
+          <w:rFonts w:ascii="Segoe UI Symbol" w:hAnsi="Segoe UI Symbol" w:cs="Segoe UI Symbol"/>
+          <w:sz w:val="22"/>
+          <w:szCs w:val="22"/>
+        </w:rPr>
+        <w:t>☐</w:t>
+      </w:r>
+      <w:r>
+        <w:rPr>
+          <w:rFonts w:ascii="Calibri" w:hAnsi="Calibri" w:cs="Calibri"/>
+          <w:sz w:val="22"/>
+          <w:szCs w:val="22"/>
+        </w:rPr>
+        <w:t xml:space="preserve"> </w:t>
+      </w:r>
+      <w:r>
+        <w:rPr>
+          <w:rFonts w:ascii="Calibri" w:hAnsi="Calibri" w:cs="Calibri"/>
+          <w:sz w:val="22"/>
+          <w:szCs w:val="22"/>
+        </w:rPr>
+        <w:t>Consult note</w:t>
+      </w:r>
+      <w:r>
+        <w:rPr>
+          <w:rFonts w:ascii="Calibri" w:hAnsi="Calibri" w:cs="Calibri"/>
+          <w:sz w:val="22"/>
+          <w:szCs w:val="22"/>
+        </w:rPr>
+        <w:t>(s)</w:t>
+      </w:r>
+      <w:r>
+        <w:rPr>
+          <w:rFonts w:ascii="Calibri" w:hAnsi="Calibri" w:cs="Calibri"/>
+          <w:sz w:val="22"/>
+          <w:szCs w:val="22"/>
+        </w:rPr>
         <w:tab/>
       </w:r>
       <w:r>
+        <w:rPr>
+          <w:rFonts w:ascii="Calibri" w:hAnsi="Calibri" w:cs="Calibri"/>
+          <w:sz w:val="22"/>
+          <w:szCs w:val="22"/>
+        </w:rPr>
         <w:tab/>
       </w:r>
       <w:r>
         <w:rPr>
-          <w:b/>
-          <w:bCs/>
-        </w:rPr>
-        <w:t>Phone:</w:t>
-      </w:r>
-      <w:r>
-        <w:t xml:space="preserve"> _________________________</w:t>
+          <w:rFonts w:ascii="Segoe UI Symbol" w:hAnsi="Segoe UI Symbol" w:cs="Segoe UI Symbol"/>
+          <w:sz w:val="22"/>
+          <w:szCs w:val="22"/>
+        </w:rPr>
+        <w:t>☐</w:t>
+      </w:r>
+      <w:r>
+        <w:rPr>
+          <w:rFonts w:ascii="Calibri" w:hAnsi="Calibri" w:cs="Calibri"/>
+          <w:sz w:val="22"/>
+          <w:szCs w:val="22"/>
+        </w:rPr>
+        <w:t xml:space="preserve"> </w:t>
+      </w:r>
+      <w:r>
+        <w:rPr>
+          <w:rFonts w:ascii="Calibri" w:hAnsi="Calibri" w:cs="Calibri"/>
+          <w:sz w:val="22"/>
+          <w:szCs w:val="22"/>
+        </w:rPr>
+        <w:t xml:space="preserve"> </w:t>
+      </w:r>
+      <w:r>
+        <w:rPr>
+          <w:rFonts w:ascii="Calibri" w:hAnsi="Calibri" w:cs="Calibri"/>
+          <w:sz w:val="22"/>
+          <w:szCs w:val="22"/>
+        </w:rPr>
+        <w:t xml:space="preserve">Psych / past neuropsychological </w:t>
+      </w:r>
+      <w:r>
+        <w:rPr>
+          <w:rFonts w:ascii="Calibri" w:hAnsi="Calibri" w:cs="Calibri"/>
+          <w:sz w:val="22"/>
+          <w:szCs w:val="22"/>
+        </w:rPr>
+        <w:t>report</w:t>
+      </w:r>
+      <w:r>
+        <w:rPr>
+          <w:rFonts w:ascii="Calibri" w:hAnsi="Calibri" w:cs="Calibri"/>
+          <w:sz w:val="22"/>
+          <w:szCs w:val="22"/>
+        </w:rPr>
+        <w:t>(s)</w:t>
       </w:r>
     </w:p>
     <w:p>
       <w:pPr>
-        <w:spacing w:line="480" w:lineRule="auto"/>
-        <w:ind w:left="720"/>
-      </w:pPr>
-      <w:r>
-        <w:rPr>
-          <w:b/>
-          <w:bCs/>
-        </w:rPr>
-        <w:t>Patient email</w:t>
-      </w:r>
-      <w:r>
-        <w:rPr>
-          <w:b/>
-          <w:bCs/>
-        </w:rPr>
-        <w:t>:</w:t>
-      </w:r>
-      <w:r>
+        <w:ind w:firstLine="720"/>
+        <w:rPr>
+          <w:rFonts w:ascii="Calibri" w:hAnsi="Calibri" w:cs="Calibri"/>
+          <w:sz w:val="22"/>
+          <w:szCs w:val="22"/>
+        </w:rPr>
+      </w:pPr>
+      <w:r>
+        <w:rPr>
+          <w:rFonts w:ascii="Segoe UI Symbol" w:hAnsi="Segoe UI Symbol" w:cs="Segoe UI Symbol"/>
+          <w:sz w:val="22"/>
+          <w:szCs w:val="22"/>
+        </w:rPr>
+        <w:t>☐</w:t>
+      </w:r>
+      <w:r>
+        <w:rPr>
+          <w:rFonts w:ascii="Calibri" w:hAnsi="Calibri" w:cs="Calibri"/>
+          <w:sz w:val="22"/>
+          <w:szCs w:val="22"/>
+        </w:rPr>
         <w:t xml:space="preserve"> </w:t>
       </w:r>
       <w:r>
-        <w:t>__________________________</w:t>
-      </w:r>
-      <w:r>
-        <w:t>______________________________________</w:t>
-      </w:r>
-    </w:p>
-    <w:p>
-      <w:pPr>
-        <w:spacing w:line="480" w:lineRule="auto"/>
-        <w:ind w:left="720"/>
-      </w:pPr>
-      <w:r>
-        <w:rPr>
-          <w:b/>
-          <w:bCs/>
-        </w:rPr>
-        <w:t>Primary l</w:t>
-      </w:r>
-      <w:r>
-        <w:rPr>
-          <w:b/>
-          <w:bCs/>
-        </w:rPr>
-        <w:t xml:space="preserve">anguage(s) </w:t>
-      </w:r>
-      <w:r>
-        <w:rPr>
-          <w:b/>
-          <w:bCs/>
-        </w:rPr>
-        <w:t>s</w:t>
-      </w:r>
-      <w:r>
-        <w:rPr>
-          <w:b/>
-          <w:bCs/>
-        </w:rPr>
-        <w:t>poken:</w:t>
-      </w:r>
-      <w:r>
-        <w:t xml:space="preserve"> ________________________________</w:t>
-      </w:r>
-      <w:r>
-        <w:t>________________</w:t>
-      </w:r>
-      <w:r>
-        <w:t>_</w:t>
-      </w:r>
-    </w:p>
-    <w:p>
-      <w:pPr>
-        <w:ind w:left="720"/>
-      </w:pPr>
-      <w:r>
-        <w:rPr>
-          <w:b/>
-          <w:bCs/>
-        </w:rPr>
-        <w:t>Consent to be contacted directly by Sparrow Neuropsychology?</w:t>
-      </w:r>
-      <w:r>
-        <w:t xml:space="preserve"> ☐ Yes ☐ No</w:t>
-      </w:r>
-    </w:p>
-    <w:p>
-      <w:r>
-        <w:rPr>
-          <w:noProof/>
-        </w:rPr>
-        <w:pict w14:anchorId="5999D391">
-          <v:rect id="_x0000_i1031" alt="" style="width:468pt;height:.05pt;mso-width-percent:0;mso-height-percent:0;mso-width-percent:0;mso-height-percent:0" o:hralign="center" o:hrstd="t" o:hr="t" fillcolor="#a0a0a0" stroked="f"/>
-        </w:pict>
-      </w:r>
-    </w:p>
-    <w:p>
-      <w:pPr>
-        <w:rPr>
-          <w:b/>
-          <w:bCs/>
-        </w:rPr>
-      </w:pPr>
-      <w:r>
-        <w:rPr>
-          <w:b/>
-          <w:bCs/>
-        </w:rPr>
-        <w:br w:type="page"/>
-      </w:r>
-    </w:p>
-    <w:p>
-      <w:pPr>
-        <w:rPr>
-          <w:i/>
-          <w:iCs/>
-        </w:rPr>
-      </w:pPr>
-      <w:proofErr w:type="gramStart"/>
-      <w:r>
-        <w:rPr>
-          <w:i/>
-          <w:iCs/>
-        </w:rPr>
-        <w:lastRenderedPageBreak/>
-        <w:t>So</w:t>
-      </w:r>
-      <w:proofErr w:type="gramEnd"/>
-      <w:r>
-        <w:rPr>
-          <w:i/>
-          <w:iCs/>
-        </w:rPr>
-        <w:t xml:space="preserve"> we can help, please include the below or a consult note with relevant detail.  Thank you!</w:t>
-      </w:r>
-    </w:p>
-    <w:p>
-      <w:pPr>
-        <w:rPr>
-          <w:b/>
-          <w:bCs/>
-        </w:rPr>
-        <w:sectPr>
-          <w:headerReference w:type="even" r:id="rId9"/>
-          <w:headerReference w:type="default" r:id="rId10"/>
-          <w:footerReference w:type="even" r:id="rId11"/>
-          <w:footerReference w:type="default" r:id="rId12"/>
-          <w:headerReference w:type="first" r:id="rId13"/>
-          <w:footerReference w:type="first" r:id="rId14"/>
-          <w:pgSz w:w="12240" w:h="15840"/>
-          <w:pgMar w:top="1440" w:right="1440" w:bottom="1440" w:left="1440" w:header="708" w:footer="708" w:gutter="0"/>
-          <w:cols w:space="708"/>
-          <w:docGrid w:linePitch="360"/>
-        </w:sectPr>
-      </w:pPr>
-      <w:r>
-        <w:rPr>
-          <w:b/>
-          <w:bCs/>
-        </w:rPr>
-        <w:t>Reason for Referral</w:t>
-      </w:r>
-    </w:p>
-    <w:p>
-      <w:r>
-        <w:t xml:space="preserve">☐ Memory concerns </w:t>
-      </w:r>
-    </w:p>
-    <w:p>
-      <w:r>
-        <w:t>☐ Concussion / head injury</w:t>
-      </w:r>
-    </w:p>
-    <w:p>
-      <w:r>
-        <w:t>☐ Stroke</w:t>
-      </w:r>
-    </w:p>
-    <w:p>
-      <w:r>
-        <w:t>☐ Multiple sclerosis (MS)</w:t>
-      </w:r>
-    </w:p>
-    <w:p>
-      <w:r>
-        <w:t>☐ Epilepsy / seizure disorder</w:t>
-      </w:r>
-    </w:p>
-    <w:p>
-      <w:r>
-        <w:br w:type="column"/>
-      </w:r>
-      <w:r>
-        <w:t>☐ Brain tumor</w:t>
-      </w:r>
-    </w:p>
-    <w:p>
-      <w:r>
-        <w:t>☐ ADHD / attention difficulties</w:t>
-      </w:r>
-    </w:p>
-    <w:p>
-      <w:r>
-        <w:t>☐ Learning concerns</w:t>
-      </w:r>
-    </w:p>
-    <w:p>
-      <w:r>
-        <w:t>☐ Functional assessment (e.g., return to work/school)</w:t>
-      </w:r>
-    </w:p>
-    <w:p>
-      <w:pPr>
-        <w:sectPr>
-          <w:type w:val="continuous"/>
-          <w:pgSz w:w="12240" w:h="15840"/>
-          <w:pgMar w:top="1440" w:right="1440" w:bottom="1440" w:left="1440" w:header="708" w:footer="708" w:gutter="0"/>
-          <w:cols w:num="2" w:space="720"/>
-          <w:docGrid w:linePitch="360"/>
-        </w:sectPr>
-      </w:pPr>
-      <w:r>
+        <w:rPr>
+          <w:rFonts w:ascii="Calibri" w:hAnsi="Calibri" w:cs="Calibri"/>
+          <w:sz w:val="22"/>
+          <w:szCs w:val="22"/>
+        </w:rPr>
+        <w:t>MRI, CT, EEG</w:t>
+      </w:r>
+      <w:r>
+        <w:rPr>
+          <w:rFonts w:ascii="Calibri" w:hAnsi="Calibri" w:cs="Calibri"/>
+          <w:sz w:val="22"/>
+          <w:szCs w:val="22"/>
+        </w:rPr>
+        <w:tab/>
+      </w:r>
+      <w:r>
+        <w:rPr>
+          <w:rFonts w:ascii="Calibri" w:hAnsi="Calibri" w:cs="Calibri"/>
+          <w:sz w:val="22"/>
+          <w:szCs w:val="22"/>
+        </w:rPr>
+        <w:tab/>
+      </w:r>
+      <w:r>
+        <w:rPr>
+          <w:rFonts w:ascii="Calibri" w:hAnsi="Calibri" w:cs="Calibri"/>
+          <w:sz w:val="22"/>
+          <w:szCs w:val="22"/>
+        </w:rPr>
+        <w:tab/>
+      </w:r>
+      <w:r>
+        <w:rPr>
+          <w:rFonts w:ascii="Segoe UI Symbol" w:hAnsi="Segoe UI Symbol" w:cs="Segoe UI Symbol"/>
+          <w:sz w:val="22"/>
+          <w:szCs w:val="22"/>
+        </w:rPr>
         <w:t>☐</w:t>
       </w:r>
       <w:r>
-        <w:t xml:space="preserve"> Other:  ______________________________</w:t>
-      </w:r>
-    </w:p>
-    <w:p>
-      <w:pPr>
-        <w:rPr>
-          <w:b/>
-          <w:bCs/>
-        </w:rPr>
-      </w:pPr>
-    </w:p>
-    <w:p>
-      <w:r>
-        <w:rPr>
-          <w:b/>
-          <w:bCs/>
-        </w:rPr>
-        <w:t>Referral Question</w:t>
-      </w:r>
-      <w:r>
-        <w:rPr>
-          <w:b/>
-          <w:bCs/>
-        </w:rPr>
-        <w:t xml:space="preserve"> and relevant history</w:t>
-      </w:r>
-      <w:r>
-        <w:t>, or attach relevant consult note.</w:t>
-      </w:r>
-    </w:p>
-    <w:p/>
-    <w:p>
-      <w:pPr>
-        <w:spacing w:line="480" w:lineRule="auto"/>
-      </w:pPr>
-      <w:r>
-        <w:rPr>
-          <w:noProof/>
-        </w:rPr>
-        <w:pict w14:anchorId="581EF6D0">
-          <v:rect id="_x0000_i1030" alt="" style="width:468pt;height:.05pt;mso-width-percent:0;mso-height-percent:0;mso-width-percent:0;mso-height-percent:0" o:hralign="center" o:hrstd="t" o:hr="t" fillcolor="#a0a0a0" stroked="f"/>
-        </w:pict>
-      </w:r>
-    </w:p>
-    <w:p>
-      <w:pPr>
-        <w:spacing w:line="480" w:lineRule="auto"/>
-      </w:pPr>
-      <w:r>
-        <w:rPr>
-          <w:noProof/>
-        </w:rPr>
-        <w:pict w14:anchorId="1B29938D">
-          <v:rect id="_x0000_i1029" alt="" style="width:468pt;height:.05pt;mso-width-percent:0;mso-height-percent:0;mso-width-percent:0;mso-height-percent:0" o:hralign="center" o:hrstd="t" o:hr="t" fillcolor="#a0a0a0" stroked="f"/>
-        </w:pict>
-      </w:r>
-    </w:p>
-    <w:p>
-      <w:pPr>
-        <w:spacing w:line="480" w:lineRule="auto"/>
-      </w:pPr>
-      <w:r>
-        <w:rPr>
-          <w:noProof/>
-        </w:rPr>
-        <w:pict w14:anchorId="2D575C3C">
-          <v:rect id="_x0000_i1028" alt="" style="width:468pt;height:.05pt;mso-width-percent:0;mso-height-percent:0;mso-width-percent:0;mso-height-percent:0" o:hralign="center" o:hrstd="t" o:hr="t" fillcolor="#a0a0a0" stroked="f"/>
-        </w:pict>
-      </w:r>
-    </w:p>
-    <w:p>
-      <w:pPr>
-        <w:spacing w:line="480" w:lineRule="auto"/>
-      </w:pPr>
-      <w:r>
-        <w:rPr>
-          <w:noProof/>
-        </w:rPr>
-        <w:pict w14:anchorId="4DF530FB">
-          <v:rect id="_x0000_i1027" alt="" style="width:468pt;height:.05pt;mso-width-percent:0;mso-height-percent:0;mso-width-percent:0;mso-height-percent:0" o:hralign="center" o:hrstd="t" o:hr="t" fillcolor="#a0a0a0" stroked="f"/>
-        </w:pict>
-      </w:r>
-    </w:p>
-    <w:p>
-      <w:pPr>
-        <w:spacing w:line="480" w:lineRule="auto"/>
-      </w:pPr>
-      <w:r>
-        <w:rPr>
-          <w:noProof/>
-        </w:rPr>
-        <w:pict w14:anchorId="029E12C3">
-          <v:rect id="_x0000_i1026" alt="" style="width:468pt;height:.05pt;mso-width-percent:0;mso-height-percent:0;mso-width-percent:0;mso-height-percent:0" o:hralign="center" o:hrstd="t" o:hr="t" fillcolor="#a0a0a0" stroked="f"/>
-        </w:pict>
-      </w:r>
-    </w:p>
-    <w:p>
-      <w:pPr>
-        <w:spacing w:line="480" w:lineRule="auto"/>
-      </w:pPr>
-      <w:r>
-        <w:rPr>
-          <w:noProof/>
-        </w:rPr>
-        <w:pict w14:anchorId="62E9E5C7">
-          <v:rect id="_x0000_i1025" alt="" style="width:468pt;height:.05pt;mso-width-percent:0;mso-height-percent:0;mso-width-percent:0;mso-height-percent:0" o:hralign="center" o:hrstd="t" o:hr="t" fillcolor="#a0a0a0" stroked="f"/>
-        </w:pict>
-      </w:r>
-    </w:p>
-    <w:p>
-      <w:pPr>
-        <w:rPr>
-          <w:b/>
-          <w:bCs/>
-        </w:rPr>
-      </w:pPr>
-      <w:r>
-        <w:rPr>
-          <w:b/>
-          <w:bCs/>
-        </w:rPr>
-        <w:t>Supporting Documentation</w:t>
-      </w:r>
-      <w:r>
-        <w:t xml:space="preserve">: </w:t>
-      </w:r>
-      <w:r>
-        <w:t>please attach if available</w:t>
-      </w:r>
-      <w:r>
-        <w:t>.</w:t>
-      </w:r>
-    </w:p>
-    <w:p>
-      <w:pPr>
-        <w:numPr>
-          <w:ilvl w:val="0"/>
-          <w:numId w:val="3"/>
-        </w:numPr>
-      </w:pPr>
-      <w:r>
-        <w:t>Recent consultation notes</w:t>
-      </w:r>
-      <w:r>
-        <w:t xml:space="preserve"> (neurology, GP, emergency dept or rehab…)</w:t>
-      </w:r>
-    </w:p>
-    <w:p>
-      <w:pPr>
-        <w:numPr>
-          <w:ilvl w:val="0"/>
-          <w:numId w:val="3"/>
-        </w:numPr>
-      </w:pPr>
-      <w:r>
-        <w:t xml:space="preserve">Brain imaging </w:t>
-      </w:r>
-      <w:r>
-        <w:t>reports</w:t>
-      </w:r>
-      <w:r>
-        <w:t xml:space="preserve"> (e.g., MRI, CT, EEG)</w:t>
-      </w:r>
-    </w:p>
-    <w:p>
-      <w:pPr>
-        <w:numPr>
-          <w:ilvl w:val="0"/>
-          <w:numId w:val="3"/>
-        </w:numPr>
-      </w:pPr>
-      <w:r>
-        <w:t>Psychological/psychiatric</w:t>
-      </w:r>
-    </w:p>
-    <w:p>
-      <w:pPr>
-        <w:numPr>
-          <w:ilvl w:val="0"/>
-          <w:numId w:val="3"/>
-        </w:numPr>
-      </w:pPr>
-      <w:r>
+        <w:rPr>
+          <w:rFonts w:ascii="Calibri" w:hAnsi="Calibri" w:cs="Calibri"/>
+          <w:sz w:val="22"/>
+          <w:szCs w:val="22"/>
+        </w:rPr>
+        <w:t xml:space="preserve"> </w:t>
+      </w:r>
+      <w:r>
+        <w:rPr>
+          <w:rFonts w:ascii="Calibri" w:hAnsi="Calibri" w:cs="Calibri"/>
+          <w:sz w:val="22"/>
+          <w:szCs w:val="22"/>
+        </w:rPr>
         <w:t>Medication list</w:t>
-      </w:r>
-    </w:p>
-    <w:p>
-      <w:r>
-        <w:rPr>
-          <w:b/>
-          <w:bCs/>
-        </w:rPr>
-        <w:t>Thank you!</w:t>
       </w:r>
     </w:p>
     <w:sectPr>
+      <w:headerReference w:type="default" r:id="rId8"/>
+      <w:footerReference w:type="default" r:id="rId9"/>
       <w:type w:val="continuous"/>
       <w:pgSz w:w="12240" w:h="15840"/>
       <w:pgMar w:top="1440" w:right="1440" w:bottom="1440" w:left="1440" w:header="708" w:footer="708" w:gutter="0"/>
@@ -1084,30 +1372,17 @@
     <w:pPr>
       <w:pStyle w:val="Footer"/>
     </w:pPr>
-  </w:p>
-</w:ftr>
-</file>
-
-<file path=word/footer2.xml><?xml version="1.0" encoding="utf-8"?>
-<w:ftr xmlns:wpc="http://schemas.microsoft.com/office/word/2010/wordprocessingCanvas" xmlns:cx="http://schemas.microsoft.com/office/drawing/2014/chartex" xmlns:cx1="http://schemas.microsoft.com/office/drawing/2015/9/8/chartex" xmlns:cx2="http://schemas.microsoft.com/office/drawing/2015/10/21/chartex" xmlns:cx3="http://schemas.microsoft.com/office/drawing/2016/5/9/chartex" xmlns:cx4="http://schemas.microsoft.com/office/drawing/2016/5/10/chartex" xmlns:cx5="http://schemas.microsoft.com/office/drawing/2016/5/11/chartex" xmlns:cx6="http://schemas.microsoft.com/office/drawing/2016/5/12/chartex" xmlns:cx7="http://schemas.microsoft.com/office/drawing/2016/5/13/chartex" xmlns:cx8="http://schemas.microsoft.com/office/drawing/2016/5/14/chartex" xmlns:mc="http://schemas.openxmlformats.org/markup-compatibility/2006" xmlns:aink="http://schemas.microsoft.com/office/drawing/2016/ink" xmlns:am3d="http://schemas.microsoft.com/office/drawing/2017/model3d" xmlns:o="urn:schemas-microsoft-com:office:office" xmlns:oel="http://schemas.microsoft.com/office/2019/extlst" xmlns:r="http://schemas.openxmlformats.org/officeDocument/2006/relationships" xmlns:m="http://schemas.openxmlformats.org/officeDocument/2006/math" xmlns:v="urn:schemas-microsoft-com:vml" xmlns:wp14="http://schemas.microsoft.com/office/word/2010/wordprocessingDrawing" xmlns:wp="http://schemas.openxmlformats.org/drawingml/2006/wordprocessingDrawing" xmlns:w10="urn:schemas-microsoft-com:office:word" xmlns:w="http://schemas.openxmlformats.org/wordprocessingml/2006/main" xmlns:w14="http://schemas.microsoft.com/office/word/2010/wordml" xmlns:w15="http://schemas.microsoft.com/office/word/2012/wordml" xmlns:w16cex="http://schemas.microsoft.com/office/word/2018/wordml/cex" xmlns:w16cid="http://schemas.microsoft.com/office/word/2016/wordml/cid" xmlns:w16="http://schemas.microsoft.com/office/word/2018/wordml" xmlns:w16du="http://schemas.microsoft.com/office/word/2023/wordml/word16du" xmlns:w16sdtdh="http://schemas.microsoft.com/office/word/2020/wordml/sdtdatahash" xmlns:w16sdtfl="http://schemas.microsoft.com/office/word/2024/wordml/sdtformatlock" xmlns:w16se="http://schemas.microsoft.com/office/word/2015/wordml/symex" xmlns:wpg="http://schemas.microsoft.com/office/word/2010/wordprocessingGroup" xmlns:wpi="http://schemas.microsoft.com/office/word/2010/wordprocessingInk" xmlns:wne="http://schemas.microsoft.com/office/word/2006/wordml" xmlns:wps="http://schemas.microsoft.com/office/word/2010/wordprocessingShape" mc:Ignorable="w14 w15 w16se w16cid w16 w16cex w16sdtdh w16sdtfl w16du wp14">
-  <w:p>
-    <w:pPr>
-      <w:pStyle w:val="Footer"/>
-    </w:pPr>
     <w:r>
-      <w:t>20250</w:t>
+      <w:t>202</w:t>
     </w:r>
     <w:r>
-      <w:t>70</w:t>
+      <w:t xml:space="preserve">60513 </w:t>
     </w:r>
     <w:r>
-      <w:t>3</w:t>
+      <w:t>v</w:t>
     </w:r>
     <w:r>
-      <w:t xml:space="preserve"> v</w:t>
-    </w:r>
-    <w:r>
-      <w:t>1</w:t>
+      <w:t>2</w:t>
     </w:r>
     <w:r>
       <w:tab/>
@@ -1137,24 +1412,9 @@
     <w:r>
       <w:t xml:space="preserve"> of </w:t>
     </w:r>
-    <w:fldSimple w:instr=" NUMPAGES  \* MERGEFORMAT ">
-      <w:r>
-        <w:rPr>
-          <w:noProof/>
-        </w:rPr>
-        <w:t>2</w:t>
-      </w:r>
-    </w:fldSimple>
-  </w:p>
-</w:ftr>
-</file>
-
-<file path=word/footer3.xml><?xml version="1.0" encoding="utf-8"?>
-<w:ftr xmlns:wpc="http://schemas.microsoft.com/office/word/2010/wordprocessingCanvas" xmlns:cx="http://schemas.microsoft.com/office/drawing/2014/chartex" xmlns:cx1="http://schemas.microsoft.com/office/drawing/2015/9/8/chartex" xmlns:cx2="http://schemas.microsoft.com/office/drawing/2015/10/21/chartex" xmlns:cx3="http://schemas.microsoft.com/office/drawing/2016/5/9/chartex" xmlns:cx4="http://schemas.microsoft.com/office/drawing/2016/5/10/chartex" xmlns:cx5="http://schemas.microsoft.com/office/drawing/2016/5/11/chartex" xmlns:cx6="http://schemas.microsoft.com/office/drawing/2016/5/12/chartex" xmlns:cx7="http://schemas.microsoft.com/office/drawing/2016/5/13/chartex" xmlns:cx8="http://schemas.microsoft.com/office/drawing/2016/5/14/chartex" xmlns:mc="http://schemas.openxmlformats.org/markup-compatibility/2006" xmlns:aink="http://schemas.microsoft.com/office/drawing/2016/ink" xmlns:am3d="http://schemas.microsoft.com/office/drawing/2017/model3d" xmlns:o="urn:schemas-microsoft-com:office:office" xmlns:oel="http://schemas.microsoft.com/office/2019/extlst" xmlns:r="http://schemas.openxmlformats.org/officeDocument/2006/relationships" xmlns:m="http://schemas.openxmlformats.org/officeDocument/2006/math" xmlns:v="urn:schemas-microsoft-com:vml" xmlns:wp14="http://schemas.microsoft.com/office/word/2010/wordprocessingDrawing" xmlns:wp="http://schemas.openxmlformats.org/drawingml/2006/wordprocessingDrawing" xmlns:w10="urn:schemas-microsoft-com:office:word" xmlns:w="http://schemas.openxmlformats.org/wordprocessingml/2006/main" xmlns:w14="http://schemas.microsoft.com/office/word/2010/wordml" xmlns:w15="http://schemas.microsoft.com/office/word/2012/wordml" xmlns:w16cex="http://schemas.microsoft.com/office/word/2018/wordml/cex" xmlns:w16cid="http://schemas.microsoft.com/office/word/2016/wordml/cid" xmlns:w16="http://schemas.microsoft.com/office/word/2018/wordml" xmlns:w16du="http://schemas.microsoft.com/office/word/2023/wordml/word16du" xmlns:w16sdtdh="http://schemas.microsoft.com/office/word/2020/wordml/sdtdatahash" xmlns:w16sdtfl="http://schemas.microsoft.com/office/word/2024/wordml/sdtformatlock" xmlns:w16se="http://schemas.microsoft.com/office/word/2015/wordml/symex" xmlns:wpg="http://schemas.microsoft.com/office/word/2010/wordprocessingGroup" xmlns:wpi="http://schemas.microsoft.com/office/word/2010/wordprocessingInk" xmlns:wne="http://schemas.microsoft.com/office/word/2006/wordml" xmlns:wps="http://schemas.microsoft.com/office/word/2010/wordprocessingShape" mc:Ignorable="w14 w15 w16se w16cid w16 w16cex w16sdtdh w16sdtfl w16du wp14">
-  <w:p>
-    <w:pPr>
-      <w:pStyle w:val="Footer"/>
-    </w:pPr>
+    <w:r>
+      <w:t>1</w:t>
+    </w:r>
   </w:p>
 </w:ftr>
 </file>
@@ -1189,37 +1449,25 @@
   <w:p>
     <w:pPr>
       <w:pStyle w:val="Header"/>
-    </w:pPr>
-  </w:p>
-</w:hdr>
-</file>
-
-<file path=word/header2.xml><?xml version="1.0" encoding="utf-8"?>
-<w:hdr xmlns:wpc="http://schemas.microsoft.com/office/word/2010/wordprocessingCanvas" xmlns:cx="http://schemas.microsoft.com/office/drawing/2014/chartex" xmlns:cx1="http://schemas.microsoft.com/office/drawing/2015/9/8/chartex" xmlns:cx2="http://schemas.microsoft.com/office/drawing/2015/10/21/chartex" xmlns:cx3="http://schemas.microsoft.com/office/drawing/2016/5/9/chartex" xmlns:cx4="http://schemas.microsoft.com/office/drawing/2016/5/10/chartex" xmlns:cx5="http://schemas.microsoft.com/office/drawing/2016/5/11/chartex" xmlns:cx6="http://schemas.microsoft.com/office/drawing/2016/5/12/chartex" xmlns:cx7="http://schemas.microsoft.com/office/drawing/2016/5/13/chartex" xmlns:cx8="http://schemas.microsoft.com/office/drawing/2016/5/14/chartex" xmlns:mc="http://schemas.openxmlformats.org/markup-compatibility/2006" xmlns:aink="http://schemas.microsoft.com/office/drawing/2016/ink" xmlns:am3d="http://schemas.microsoft.com/office/drawing/2017/model3d" xmlns:o="urn:schemas-microsoft-com:office:office" xmlns:oel="http://schemas.microsoft.com/office/2019/extlst" xmlns:r="http://schemas.openxmlformats.org/officeDocument/2006/relationships" xmlns:m="http://schemas.openxmlformats.org/officeDocument/2006/math" xmlns:v="urn:schemas-microsoft-com:vml" xmlns:wp14="http://schemas.microsoft.com/office/word/2010/wordprocessingDrawing" xmlns:wp="http://schemas.openxmlformats.org/drawingml/2006/wordprocessingDrawing" xmlns:w10="urn:schemas-microsoft-com:office:word" xmlns:w="http://schemas.openxmlformats.org/wordprocessingml/2006/main" xmlns:w14="http://schemas.microsoft.com/office/word/2010/wordml" xmlns:w15="http://schemas.microsoft.com/office/word/2012/wordml" xmlns:w16cex="http://schemas.microsoft.com/office/word/2018/wordml/cex" xmlns:w16cid="http://schemas.microsoft.com/office/word/2016/wordml/cid" xmlns:w16="http://schemas.microsoft.com/office/word/2018/wordml" xmlns:w16du="http://schemas.microsoft.com/office/word/2023/wordml/word16du" xmlns:w16sdtdh="http://schemas.microsoft.com/office/word/2020/wordml/sdtdatahash" xmlns:w16sdtfl="http://schemas.microsoft.com/office/word/2024/wordml/sdtformatlock" xmlns:w16se="http://schemas.microsoft.com/office/word/2015/wordml/symex" xmlns:wpg="http://schemas.microsoft.com/office/word/2010/wordprocessingGroup" xmlns:wpi="http://schemas.microsoft.com/office/word/2010/wordprocessingInk" xmlns:wne="http://schemas.microsoft.com/office/word/2006/wordml" xmlns:wps="http://schemas.microsoft.com/office/word/2010/wordprocessingShape" mc:Ignorable="w14 w15 w16se w16cid w16 w16cex w16sdtdh w16sdtfl w16du wp14">
-  <w:p>
-    <w:pPr>
-      <w:pStyle w:val="Header"/>
+      <w:jc w:val="right"/>
     </w:pPr>
     <w:r>
       <w:rPr>
         <w:b/>
         <w:bCs/>
+        <w:u w:val="single"/>
       </w:rPr>
       <w:t>Confidential</w:t>
     </w:r>
     <w:r>
-      <w:t>.  Please discard if received in error.</w:t>
+      <w:t xml:space="preserve">.  </w:t>
     </w:r>
-  </w:p>
-</w:hdr>
-</file>
-
-<file path=word/header3.xml><?xml version="1.0" encoding="utf-8"?>
-<w:hdr xmlns:wpc="http://schemas.microsoft.com/office/word/2010/wordprocessingCanvas" xmlns:cx="http://schemas.microsoft.com/office/drawing/2014/chartex" xmlns:cx1="http://schemas.microsoft.com/office/drawing/2015/9/8/chartex" xmlns:cx2="http://schemas.microsoft.com/office/drawing/2015/10/21/chartex" xmlns:cx3="http://schemas.microsoft.com/office/drawing/2016/5/9/chartex" xmlns:cx4="http://schemas.microsoft.com/office/drawing/2016/5/10/chartex" xmlns:cx5="http://schemas.microsoft.com/office/drawing/2016/5/11/chartex" xmlns:cx6="http://schemas.microsoft.com/office/drawing/2016/5/12/chartex" xmlns:cx7="http://schemas.microsoft.com/office/drawing/2016/5/13/chartex" xmlns:cx8="http://schemas.microsoft.com/office/drawing/2016/5/14/chartex" xmlns:mc="http://schemas.openxmlformats.org/markup-compatibility/2006" xmlns:aink="http://schemas.microsoft.com/office/drawing/2016/ink" xmlns:am3d="http://schemas.microsoft.com/office/drawing/2017/model3d" xmlns:o="urn:schemas-microsoft-com:office:office" xmlns:oel="http://schemas.microsoft.com/office/2019/extlst" xmlns:r="http://schemas.openxmlformats.org/officeDocument/2006/relationships" xmlns:m="http://schemas.openxmlformats.org/officeDocument/2006/math" xmlns:v="urn:schemas-microsoft-com:vml" xmlns:wp14="http://schemas.microsoft.com/office/word/2010/wordprocessingDrawing" xmlns:wp="http://schemas.openxmlformats.org/drawingml/2006/wordprocessingDrawing" xmlns:w10="urn:schemas-microsoft-com:office:word" xmlns:w="http://schemas.openxmlformats.org/wordprocessingml/2006/main" xmlns:w14="http://schemas.microsoft.com/office/word/2010/wordml" xmlns:w15="http://schemas.microsoft.com/office/word/2012/wordml" xmlns:w16cex="http://schemas.microsoft.com/office/word/2018/wordml/cex" xmlns:w16cid="http://schemas.microsoft.com/office/word/2016/wordml/cid" xmlns:w16="http://schemas.microsoft.com/office/word/2018/wordml" xmlns:w16du="http://schemas.microsoft.com/office/word/2023/wordml/word16du" xmlns:w16sdtdh="http://schemas.microsoft.com/office/word/2020/wordml/sdtdatahash" xmlns:w16sdtfl="http://schemas.microsoft.com/office/word/2024/wordml/sdtformatlock" xmlns:w16se="http://schemas.microsoft.com/office/word/2015/wordml/symex" xmlns:wpg="http://schemas.microsoft.com/office/word/2010/wordprocessingGroup" xmlns:wpi="http://schemas.microsoft.com/office/word/2010/wordprocessingInk" xmlns:wne="http://schemas.microsoft.com/office/word/2006/wordml" xmlns:wps="http://schemas.microsoft.com/office/word/2010/wordprocessingShape" mc:Ignorable="w14 w15 w16se w16cid w16 w16cex w16sdtdh w16sdtfl w16du wp14">
-  <w:p>
-    <w:pPr>
-      <w:pStyle w:val="Header"/>
-    </w:pPr>
+    <w:r>
+      <w:t xml:space="preserve">Please destroy </w:t>
+    </w:r>
+    <w:r>
+      <w:t>if received in error.</w:t>
+    </w:r>
   </w:p>
 </w:hdr>
 </file>
@@ -1227,6 +1475,118 @@
 <file path=word/numbering.xml><?xml version="1.0" encoding="utf-8"?>
 <w:numbering xmlns:wpc="http://schemas.microsoft.com/office/word/2010/wordprocessingCanvas" xmlns:cx="http://schemas.microsoft.com/office/drawing/2014/chartex" xmlns:cx1="http://schemas.microsoft.com/office/drawing/2015/9/8/chartex" xmlns:cx2="http://schemas.microsoft.com/office/drawing/2015/10/21/chartex" xmlns:cx3="http://schemas.microsoft.com/office/drawing/2016/5/9/chartex" xmlns:cx4="http://schemas.microsoft.com/office/drawing/2016/5/10/chartex" xmlns:cx5="http://schemas.microsoft.com/office/drawing/2016/5/11/chartex" xmlns:cx6="http://schemas.microsoft.com/office/drawing/2016/5/12/chartex" xmlns:cx7="http://schemas.microsoft.com/office/drawing/2016/5/13/chartex" xmlns:cx8="http://schemas.microsoft.com/office/drawing/2016/5/14/chartex" xmlns:mc="http://schemas.openxmlformats.org/markup-compatibility/2006" xmlns:aink="http://schemas.microsoft.com/office/drawing/2016/ink" xmlns:am3d="http://schemas.microsoft.com/office/drawing/2017/model3d" xmlns:o="urn:schemas-microsoft-com:office:office" xmlns:oel="http://schemas.microsoft.com/office/2019/extlst" xmlns:r="http://schemas.openxmlformats.org/officeDocument/2006/relationships" xmlns:m="http://schemas.openxmlformats.org/officeDocument/2006/math" xmlns:v="urn:schemas-microsoft-com:vml" xmlns:wp14="http://schemas.microsoft.com/office/word/2010/wordprocessingDrawing" xmlns:wp="http://schemas.openxmlformats.org/drawingml/2006/wordprocessingDrawing" xmlns:w10="urn:schemas-microsoft-com:office:word" xmlns:w="http://schemas.openxmlformats.org/wordprocessingml/2006/main" xmlns:w14="http://schemas.microsoft.com/office/word/2010/wordml" xmlns:w15="http://schemas.microsoft.com/office/word/2012/wordml" xmlns:w16cex="http://schemas.microsoft.com/office/word/2018/wordml/cex" xmlns:w16cid="http://schemas.microsoft.com/office/word/2016/wordml/cid" xmlns:w16="http://schemas.microsoft.com/office/word/2018/wordml" xmlns:w16du="http://schemas.microsoft.com/office/word/2023/wordml/word16du" xmlns:w16sdtdh="http://schemas.microsoft.com/office/word/2020/wordml/sdtdatahash" xmlns:w16sdtfl="http://schemas.microsoft.com/office/word/2024/wordml/sdtformatlock" xmlns:w16se="http://schemas.microsoft.com/office/word/2015/wordml/symex" xmlns:wpg="http://schemas.microsoft.com/office/word/2010/wordprocessingGroup" xmlns:wpi="http://schemas.microsoft.com/office/word/2010/wordprocessingInk" xmlns:wne="http://schemas.microsoft.com/office/word/2006/wordml" xmlns:wps="http://schemas.microsoft.com/office/word/2010/wordprocessingShape" mc:Ignorable="w14 w15 w16se w16cid w16 w16cex w16sdtdh w16sdtfl w16du wp14">
   <w:abstractNum w:abstractNumId="0" w15:restartNumberingAfterBreak="0">
+    <w:nsid w:val="172E6F62"/>
+    <w:multiLevelType w:val="hybridMultilevel"/>
+    <w:tmpl w:val="451836F4"/>
+    <w:lvl w:ilvl="0" w:tplc="00A40490">
+      <w:numFmt w:val="bullet"/>
+      <w:lvlText w:val="-"/>
+      <w:lvlJc w:val="left"/>
+      <w:pPr>
+        <w:ind w:left="720" w:hanging="360"/>
+      </w:pPr>
+      <w:rPr>
+        <w:rFonts w:ascii="Aptos" w:eastAsiaTheme="minorHAnsi" w:hAnsi="Aptos" w:cstheme="minorBidi" w:hint="default"/>
+      </w:rPr>
+    </w:lvl>
+    <w:lvl w:ilvl="1" w:tplc="04090003" w:tentative="1">
+      <w:start w:val="1"/>
+      <w:numFmt w:val="bullet"/>
+      <w:lvlText w:val="o"/>
+      <w:lvlJc w:val="left"/>
+      <w:pPr>
+        <w:ind w:left="1440" w:hanging="360"/>
+      </w:pPr>
+      <w:rPr>
+        <w:rFonts w:ascii="Courier New" w:hAnsi="Courier New" w:cs="Courier New" w:hint="default"/>
+      </w:rPr>
+    </w:lvl>
+    <w:lvl w:ilvl="2" w:tplc="04090005" w:tentative="1">
+      <w:start w:val="1"/>
+      <w:numFmt w:val="bullet"/>
+      <w:lvlText w:val=""/>
+      <w:lvlJc w:val="left"/>
+      <w:pPr>
+        <w:ind w:left="2160" w:hanging="360"/>
+      </w:pPr>
+      <w:rPr>
+        <w:rFonts w:ascii="Wingdings" w:hAnsi="Wingdings" w:hint="default"/>
+      </w:rPr>
+    </w:lvl>
+    <w:lvl w:ilvl="3" w:tplc="04090001" w:tentative="1">
+      <w:start w:val="1"/>
+      <w:numFmt w:val="bullet"/>
+      <w:lvlText w:val=""/>
+      <w:lvlJc w:val="left"/>
+      <w:pPr>
+        <w:ind w:left="2880" w:hanging="360"/>
+      </w:pPr>
+      <w:rPr>
+        <w:rFonts w:ascii="Symbol" w:hAnsi="Symbol" w:hint="default"/>
+      </w:rPr>
+    </w:lvl>
+    <w:lvl w:ilvl="4" w:tplc="04090003" w:tentative="1">
+      <w:start w:val="1"/>
+      <w:numFmt w:val="bullet"/>
+      <w:lvlText w:val="o"/>
+      <w:lvlJc w:val="left"/>
+      <w:pPr>
+        <w:ind w:left="3600" w:hanging="360"/>
+      </w:pPr>
+      <w:rPr>
+        <w:rFonts w:ascii="Courier New" w:hAnsi="Courier New" w:cs="Courier New" w:hint="default"/>
+      </w:rPr>
+    </w:lvl>
+    <w:lvl w:ilvl="5" w:tplc="04090005" w:tentative="1">
+      <w:start w:val="1"/>
+      <w:numFmt w:val="bullet"/>
+      <w:lvlText w:val=""/>
+      <w:lvlJc w:val="left"/>
+      <w:pPr>
+        <w:ind w:left="4320" w:hanging="360"/>
+      </w:pPr>
+      <w:rPr>
+        <w:rFonts w:ascii="Wingdings" w:hAnsi="Wingdings" w:hint="default"/>
+      </w:rPr>
+    </w:lvl>
+    <w:lvl w:ilvl="6" w:tplc="04090001" w:tentative="1">
+      <w:start w:val="1"/>
+      <w:numFmt w:val="bullet"/>
+      <w:lvlText w:val=""/>
+      <w:lvlJc w:val="left"/>
+      <w:pPr>
+        <w:ind w:left="5040" w:hanging="360"/>
+      </w:pPr>
+      <w:rPr>
+        <w:rFonts w:ascii="Symbol" w:hAnsi="Symbol" w:hint="default"/>
+      </w:rPr>
+    </w:lvl>
+    <w:lvl w:ilvl="7" w:tplc="04090003" w:tentative="1">
+      <w:start w:val="1"/>
+      <w:numFmt w:val="bullet"/>
+      <w:lvlText w:val="o"/>
+      <w:lvlJc w:val="left"/>
+      <w:pPr>
+        <w:ind w:left="5760" w:hanging="360"/>
+      </w:pPr>
+      <w:rPr>
+        <w:rFonts w:ascii="Courier New" w:hAnsi="Courier New" w:cs="Courier New" w:hint="default"/>
+      </w:rPr>
+    </w:lvl>
+    <w:lvl w:ilvl="8" w:tplc="04090005" w:tentative="1">
+      <w:start w:val="1"/>
+      <w:numFmt w:val="bullet"/>
+      <w:lvlText w:val=""/>
+      <w:lvlJc w:val="left"/>
+      <w:pPr>
+        <w:ind w:left="6480" w:hanging="360"/>
+      </w:pPr>
+      <w:rPr>
+        <w:rFonts w:ascii="Wingdings" w:hAnsi="Wingdings" w:hint="default"/>
+      </w:rPr>
+    </w:lvl>
+  </w:abstractNum>
+  <w:abstractNum w:abstractNumId="1" w15:restartNumberingAfterBreak="0">
     <w:nsid w:val="65385FF0"/>
     <w:multiLevelType w:val="multilevel"/>
     <w:tmpl w:val="697A0B7E"/>
@@ -1375,7 +1735,7 @@
       </w:rPr>
     </w:lvl>
   </w:abstractNum>
-  <w:abstractNum w:abstractNumId="1" w15:restartNumberingAfterBreak="0">
+  <w:abstractNum w:abstractNumId="2" w15:restartNumberingAfterBreak="0">
     <w:nsid w:val="763D49A1"/>
     <w:multiLevelType w:val="multilevel"/>
     <w:tmpl w:val="F754F3CC"/>
@@ -1524,7 +1884,7 @@
       </w:rPr>
     </w:lvl>
   </w:abstractNum>
-  <w:abstractNum w:abstractNumId="2" w15:restartNumberingAfterBreak="0">
+  <w:abstractNum w:abstractNumId="3" w15:restartNumberingAfterBreak="0">
     <w:nsid w:val="78BA4AD5"/>
     <w:multiLevelType w:val="multilevel"/>
     <w:tmpl w:val="23889952"/>
@@ -1674,12 +2034,15 @@
     </w:lvl>
   </w:abstractNum>
   <w:num w:numId="1" w16cid:durableId="945845308">
+    <w:abstractNumId w:val="3"/>
+  </w:num>
+  <w:num w:numId="2" w16cid:durableId="1262841335">
     <w:abstractNumId w:val="2"/>
   </w:num>
-  <w:num w:numId="2" w16cid:durableId="1262841335">
+  <w:num w:numId="3" w16cid:durableId="655568320">
     <w:abstractNumId w:val="1"/>
   </w:num>
-  <w:num w:numId="3" w16cid:durableId="655568320">
+  <w:num w:numId="4" w16cid:durableId="1702972160">
     <w:abstractNumId w:val="0"/>
   </w:num>
 </w:numbering>
@@ -2669,6 +3032,25 @@
     <w:uiPriority w:val="99"/>
     <w:rsid w:val="00A05D6C"/>
   </w:style>
+  <w:style w:type="table" w:styleId="TableGrid">
+    <w:name w:val="Table Grid"/>
+    <w:basedOn w:val="TableNormal"/>
+    <w:uiPriority w:val="39"/>
+    <w:rsid w:val="00FB244A"/>
+    <w:pPr>
+      <w:spacing w:after="0" w:line="240" w:lineRule="auto"/>
+    </w:pPr>
+    <w:tblPr>
+      <w:tblBorders>
+        <w:top w:val="single" w:sz="4" w:space="0" w:color="auto"/>
+        <w:left w:val="single" w:sz="4" w:space="0" w:color="auto"/>
+        <w:bottom w:val="single" w:sz="4" w:space="0" w:color="auto"/>
+        <w:right w:val="single" w:sz="4" w:space="0" w:color="auto"/>
+        <w:insideH w:val="single" w:sz="4" w:space="0" w:color="auto"/>
+        <w:insideV w:val="single" w:sz="4" w:space="0" w:color="auto"/>
+      </w:tblBorders>
+    </w:tblPr>
+  </w:style>
 </w:styles>
 </file>
 

</xml_diff>

<commit_message>
Update referral form (revised 2026-05-13)
Co-Authored-By: Claude Opus 4.7 (1M context) <noreply@anthropic.com>
</commit_message>
<xml_diff>
--- a/assets/files/referral-form.docx
+++ b/assets/files/referral-form.docx
@@ -22,7 +22,7 @@
           <w:szCs w:val="32"/>
         </w:rPr>
         <w:drawing>
-          <wp:anchor distT="0" distB="0" distL="114300" distR="114300" simplePos="0" relativeHeight="251658240" behindDoc="1" locked="0" layoutInCell="1" allowOverlap="1" wp14:anchorId="377F9A89" wp14:editId="71F8E271">
+          <wp:anchor distT="0" distB="0" distL="114300" distR="114300" simplePos="0" relativeHeight="251658240" behindDoc="1" locked="0" layoutInCell="1" allowOverlap="1" wp14:anchorId="377F9A89" wp14:editId="60716D4D">
             <wp:simplePos x="0" y="0"/>
             <wp:positionH relativeFrom="column">
               <wp:posOffset>4995511</wp:posOffset>
@@ -256,7 +256,7 @@
           <w:sz w:val="22"/>
           <w:szCs w:val="22"/>
         </w:rPr>
-        <w:pict w14:anchorId="08CC1EC8">
+        <w:pict w14:anchorId="21DD3CE3">
           <v:rect id="_x0000_i1026" alt="" style="width:468pt;height:.05pt;mso-width-percent:0;mso-height-percent:0;mso-width-percent:0;mso-height-percent:0" o:hralign="center" o:hrstd="t" o:hr="t" fillcolor="#a0a0a0" stroked="f"/>
         </w:pict>
       </w:r>
@@ -529,7 +529,7 @@
           <w:sz w:val="22"/>
           <w:szCs w:val="22"/>
         </w:rPr>
-        <w:pict w14:anchorId="18172268">
+        <w:pict w14:anchorId="64BAB317">
           <v:rect id="_x0000_i1025" alt="" style="width:468pt;height:.05pt;mso-width-percent:0;mso-height-percent:0;mso-width-percent:0;mso-height-percent:0" o:hralign="center" o:hrstd="t" o:hr="t" fillcolor="#a0a0a0" stroked="f"/>
         </w:pict>
       </w:r>
@@ -1163,15 +1163,7 @@
           <w:sz w:val="22"/>
           <w:szCs w:val="22"/>
         </w:rPr>
-        <w:t xml:space="preserve"> </w:t>
-      </w:r>
-      <w:r>
-        <w:rPr>
-          <w:rFonts w:ascii="Calibri" w:hAnsi="Calibri" w:cs="Calibri"/>
-          <w:sz w:val="22"/>
-          <w:szCs w:val="22"/>
-        </w:rPr>
-        <w:t>Consult note</w:t>
+        <w:t xml:space="preserve"> Consult note</w:t>
       </w:r>
       <w:r>
         <w:rPr>
@@ -1211,15 +1203,7 @@
           <w:sz w:val="22"/>
           <w:szCs w:val="22"/>
         </w:rPr>
-        <w:t xml:space="preserve"> </w:t>
-      </w:r>
-      <w:r>
-        <w:rPr>
-          <w:rFonts w:ascii="Calibri" w:hAnsi="Calibri" w:cs="Calibri"/>
-          <w:sz w:val="22"/>
-          <w:szCs w:val="22"/>
-        </w:rPr>
-        <w:t xml:space="preserve"> </w:t>
+        <w:t xml:space="preserve">  </w:t>
       </w:r>
       <w:r>
         <w:rPr>
@@ -1269,15 +1253,7 @@
           <w:sz w:val="22"/>
           <w:szCs w:val="22"/>
         </w:rPr>
-        <w:t xml:space="preserve"> </w:t>
-      </w:r>
-      <w:r>
-        <w:rPr>
-          <w:rFonts w:ascii="Calibri" w:hAnsi="Calibri" w:cs="Calibri"/>
-          <w:sz w:val="22"/>
-          <w:szCs w:val="22"/>
-        </w:rPr>
-        <w:t>MRI, CT, EEG</w:t>
+        <w:t xml:space="preserve"> MRI, CT, EEG</w:t>
       </w:r>
       <w:r>
         <w:rPr>
@@ -1317,20 +1293,11 @@
           <w:sz w:val="22"/>
           <w:szCs w:val="22"/>
         </w:rPr>
-        <w:t xml:space="preserve"> </w:t>
-      </w:r>
-      <w:r>
-        <w:rPr>
-          <w:rFonts w:ascii="Calibri" w:hAnsi="Calibri" w:cs="Calibri"/>
-          <w:sz w:val="22"/>
-          <w:szCs w:val="22"/>
-        </w:rPr>
-        <w:t>Medication list</w:t>
+        <w:t xml:space="preserve"> Medication list</w:t>
       </w:r>
     </w:p>
     <w:sectPr>
-      <w:headerReference w:type="default" r:id="rId8"/>
-      <w:footerReference w:type="default" r:id="rId9"/>
+      <w:footerReference w:type="default" r:id="rId8"/>
       <w:type w:val="continuous"/>
       <w:pgSz w:w="12240" w:h="15840"/>
       <w:pgMar w:top="1440" w:right="1440" w:bottom="1440" w:left="1440" w:header="708" w:footer="708" w:gutter="0"/>
@@ -1442,34 +1409,6 @@
     </w:p>
   </w:footnote>
 </w:footnotes>
-</file>
-
-<file path=word/header1.xml><?xml version="1.0" encoding="utf-8"?>
-<w:hdr xmlns:wpc="http://schemas.microsoft.com/office/word/2010/wordprocessingCanvas" xmlns:cx="http://schemas.microsoft.com/office/drawing/2014/chartex" xmlns:cx1="http://schemas.microsoft.com/office/drawing/2015/9/8/chartex" xmlns:cx2="http://schemas.microsoft.com/office/drawing/2015/10/21/chartex" xmlns:cx3="http://schemas.microsoft.com/office/drawing/2016/5/9/chartex" xmlns:cx4="http://schemas.microsoft.com/office/drawing/2016/5/10/chartex" xmlns:cx5="http://schemas.microsoft.com/office/drawing/2016/5/11/chartex" xmlns:cx6="http://schemas.microsoft.com/office/drawing/2016/5/12/chartex" xmlns:cx7="http://schemas.microsoft.com/office/drawing/2016/5/13/chartex" xmlns:cx8="http://schemas.microsoft.com/office/drawing/2016/5/14/chartex" xmlns:mc="http://schemas.openxmlformats.org/markup-compatibility/2006" xmlns:aink="http://schemas.microsoft.com/office/drawing/2016/ink" xmlns:am3d="http://schemas.microsoft.com/office/drawing/2017/model3d" xmlns:o="urn:schemas-microsoft-com:office:office" xmlns:oel="http://schemas.microsoft.com/office/2019/extlst" xmlns:r="http://schemas.openxmlformats.org/officeDocument/2006/relationships" xmlns:m="http://schemas.openxmlformats.org/officeDocument/2006/math" xmlns:v="urn:schemas-microsoft-com:vml" xmlns:wp14="http://schemas.microsoft.com/office/word/2010/wordprocessingDrawing" xmlns:wp="http://schemas.openxmlformats.org/drawingml/2006/wordprocessingDrawing" xmlns:w10="urn:schemas-microsoft-com:office:word" xmlns:w="http://schemas.openxmlformats.org/wordprocessingml/2006/main" xmlns:w14="http://schemas.microsoft.com/office/word/2010/wordml" xmlns:w15="http://schemas.microsoft.com/office/word/2012/wordml" xmlns:w16cex="http://schemas.microsoft.com/office/word/2018/wordml/cex" xmlns:w16cid="http://schemas.microsoft.com/office/word/2016/wordml/cid" xmlns:w16="http://schemas.microsoft.com/office/word/2018/wordml" xmlns:w16du="http://schemas.microsoft.com/office/word/2023/wordml/word16du" xmlns:w16sdtdh="http://schemas.microsoft.com/office/word/2020/wordml/sdtdatahash" xmlns:w16sdtfl="http://schemas.microsoft.com/office/word/2024/wordml/sdtformatlock" xmlns:w16se="http://schemas.microsoft.com/office/word/2015/wordml/symex" xmlns:wpg="http://schemas.microsoft.com/office/word/2010/wordprocessingGroup" xmlns:wpi="http://schemas.microsoft.com/office/word/2010/wordprocessingInk" xmlns:wne="http://schemas.microsoft.com/office/word/2006/wordml" xmlns:wps="http://schemas.microsoft.com/office/word/2010/wordprocessingShape" mc:Ignorable="w14 w15 w16se w16cid w16 w16cex w16sdtdh w16sdtfl w16du wp14">
-  <w:p>
-    <w:pPr>
-      <w:pStyle w:val="Header"/>
-      <w:jc w:val="right"/>
-    </w:pPr>
-    <w:r>
-      <w:rPr>
-        <w:b/>
-        <w:bCs/>
-        <w:u w:val="single"/>
-      </w:rPr>
-      <w:t>Confidential</w:t>
-    </w:r>
-    <w:r>
-      <w:t xml:space="preserve">.  </w:t>
-    </w:r>
-    <w:r>
-      <w:t xml:space="preserve">Please destroy </w:t>
-    </w:r>
-    <w:r>
-      <w:t>if received in error.</w:t>
-    </w:r>
-  </w:p>
-</w:hdr>
 </file>
 
 <file path=word/numbering.xml><?xml version="1.0" encoding="utf-8"?>

</xml_diff>

<commit_message>
Fix wrong fax number on downloadable referral form
The PDF/Word referral form had an outdated fax number; update to
match the current fax (236) 501-5099, same as phone.

Co-Authored-By: Claude Sonnet 5 <noreply@anthropic.com>
</commit_message>
<xml_diff>
--- a/assets/files/referral-form.docx
+++ b/assets/files/referral-form.docx
@@ -1,6 +1,6 @@
 
 <file path=word/document.xml><?xml version="1.0" encoding="utf-8"?>
-<w:document xmlns:wpc="http://schemas.microsoft.com/office/word/2010/wordprocessingCanvas" xmlns:cx="http://schemas.microsoft.com/office/drawing/2014/chartex" xmlns:cx1="http://schemas.microsoft.com/office/drawing/2015/9/8/chartex" xmlns:cx2="http://schemas.microsoft.com/office/drawing/2015/10/21/chartex" xmlns:cx3="http://schemas.microsoft.com/office/drawing/2016/5/9/chartex" xmlns:cx4="http://schemas.microsoft.com/office/drawing/2016/5/10/chartex" xmlns:cx5="http://schemas.microsoft.com/office/drawing/2016/5/11/chartex" xmlns:cx6="http://schemas.microsoft.com/office/drawing/2016/5/12/chartex" xmlns:cx7="http://schemas.microsoft.com/office/drawing/2016/5/13/chartex" xmlns:cx8="http://schemas.microsoft.com/office/drawing/2016/5/14/chartex" xmlns:mc="http://schemas.openxmlformats.org/markup-compatibility/2006" xmlns:aink="http://schemas.microsoft.com/office/drawing/2016/ink" xmlns:am3d="http://schemas.microsoft.com/office/drawing/2017/model3d" xmlns:o="urn:schemas-microsoft-com:office:office" xmlns:oel="http://schemas.microsoft.com/office/2019/extlst" xmlns:r="http://schemas.openxmlformats.org/officeDocument/2006/relationships" xmlns:m="http://schemas.openxmlformats.org/officeDocument/2006/math" xmlns:v="urn:schemas-microsoft-com:vml" xmlns:wp14="http://schemas.microsoft.com/office/word/2010/wordprocessingDrawing" xmlns:wp="http://schemas.openxmlformats.org/drawingml/2006/wordprocessingDrawing" xmlns:w10="urn:schemas-microsoft-com:office:word" xmlns:w="http://schemas.openxmlformats.org/wordprocessingml/2006/main" xmlns:w14="http://schemas.microsoft.com/office/word/2010/wordml" xmlns:w15="http://schemas.microsoft.com/office/word/2012/wordml" xmlns:w16cex="http://schemas.microsoft.com/office/word/2018/wordml/cex" xmlns:w16cid="http://schemas.microsoft.com/office/word/2016/wordml/cid" xmlns:w16="http://schemas.microsoft.com/office/word/2018/wordml" xmlns:w16du="http://schemas.microsoft.com/office/word/2023/wordml/word16du" xmlns:w16sdtdh="http://schemas.microsoft.com/office/word/2020/wordml/sdtdatahash" xmlns:w16sdtfl="http://schemas.microsoft.com/office/word/2024/wordml/sdtformatlock" xmlns:w16se="http://schemas.microsoft.com/office/word/2015/wordml/symex" xmlns:wpg="http://schemas.microsoft.com/office/word/2010/wordprocessingGroup" xmlns:wpi="http://schemas.microsoft.com/office/word/2010/wordprocessingInk" xmlns:wne="http://schemas.microsoft.com/office/word/2006/wordml" xmlns:wps="http://schemas.microsoft.com/office/word/2010/wordprocessingShape" mc:Ignorable="w14 w15 w16se w16cid w16 w16cex w16sdtdh w16sdtfl w16du wp14">
+<w:document xmlns:wpc="http://schemas.microsoft.com/office/word/2010/wordprocessingCanvas" xmlns:cx="http://schemas.microsoft.com/office/drawing/2014/chartex" xmlns:cx1="http://schemas.microsoft.com/office/drawing/2015/9/8/chartex" xmlns:cx2="http://schemas.microsoft.com/office/drawing/2015/10/21/chartex" xmlns:cx3="http://schemas.microsoft.com/office/drawing/2016/5/9/chartex" xmlns:cx4="http://schemas.microsoft.com/office/drawing/2016/5/10/chartex" xmlns:cx5="http://schemas.microsoft.com/office/drawing/2016/5/11/chartex" xmlns:cx6="http://schemas.microsoft.com/office/drawing/2016/5/12/chartex" xmlns:cx7="http://schemas.microsoft.com/office/drawing/2016/5/13/chartex" xmlns:cx8="http://schemas.microsoft.com/office/drawing/2016/5/14/chartex" xmlns:mc="http://schemas.openxmlformats.org/markup-compatibility/2006" xmlns:m="http://schemas.openxmlformats.org/officeDocument/2006/math" xmlns:aink="http://schemas.microsoft.com/office/drawing/2016/ink" xmlns:am3d="http://schemas.microsoft.com/office/drawing/2017/model3d" xmlns:oel="http://schemas.microsoft.com/office/2019/extlst" xmlns:r="http://schemas.openxmlformats.org/officeDocument/2006/relationships" xmlns:wp14="http://schemas.microsoft.com/office/word/2010/wordprocessingDrawing" xmlns:wp="http://schemas.openxmlformats.org/drawingml/2006/wordprocessingDrawing" xmlns:wpg="http://schemas.microsoft.com/office/word/2010/wordprocessingGroup" xmlns:wpi="http://schemas.microsoft.com/office/word/2010/wordprocessingInk" xmlns:wps="http://schemas.microsoft.com/office/word/2010/wordprocessingShape" xmlns:o="urn:schemas-microsoft-com:office:office" xmlns:v="urn:schemas-microsoft-com:vml" xmlns:w10="urn:schemas-microsoft-com:office:word" xmlns:w="http://schemas.openxmlformats.org/wordprocessingml/2006/main" xmlns:w14="http://schemas.microsoft.com/office/word/2010/wordml" xmlns:w15="http://schemas.microsoft.com/office/word/2012/wordml" xmlns:w16cex="http://schemas.microsoft.com/office/word/2018/wordml/cex" xmlns:w16cid="http://schemas.microsoft.com/office/word/2016/wordml/cid" xmlns:w16="http://schemas.microsoft.com/office/word/2018/wordml" xmlns:w16sdtdh="http://schemas.microsoft.com/office/word/2020/wordml/sdtdatahash" xmlns:w16sdtfl="http://schemas.microsoft.com/office/word/2024/wordml/sdtformatlock" xmlns:w16se="http://schemas.microsoft.com/office/word/2015/wordml/symex" xmlns:w16du="http://schemas.microsoft.com/office/word/2023/wordml/word16du" xmlns:wne="http://schemas.microsoft.com/office/word/2006/wordml" mc:Ignorable="w14 w15 w16se w16cid w16 w16cex w16sdtdh w16sdtfl w16du wp14">
   <w:body>
     <w:p>
       <w:pPr>
@@ -22,7 +22,7 @@
           <w:szCs w:val="32"/>
         </w:rPr>
         <w:drawing>
-          <wp:anchor distT="0" distB="0" distL="114300" distR="114300" simplePos="0" relativeHeight="251658240" behindDoc="1" locked="0" layoutInCell="1" allowOverlap="1" wp14:anchorId="377F9A89" wp14:editId="60716D4D">
+          <wp:anchor distT="0" distB="0" distL="114300" distR="114300" simplePos="0" relativeHeight="251658240" behindDoc="1" locked="0" layoutInCell="1" allowOverlap="1" wp14:anchorId="377F9A89" wp14:editId="467C0169">
             <wp:simplePos x="0" y="0"/>
             <wp:positionH relativeFrom="column">
               <wp:posOffset>4995511</wp:posOffset>
@@ -141,7 +141,35 @@
           <w:sz w:val="22"/>
           <w:szCs w:val="22"/>
         </w:rPr>
-        <w:t>(236) 259 5318</w:t>
+        <w:t xml:space="preserve">(236) </w:t>
+      </w:r>
+      <w:r>
+        <w:rPr>
+          <w:rFonts w:ascii="Calibri" w:hAnsi="Calibri" w:cs="Calibri"/>
+          <w:b/>
+          <w:bCs/>
+          <w:sz w:val="22"/>
+          <w:szCs w:val="22"/>
+        </w:rPr>
+        <w:t>501 5099</w:t>
+      </w:r>
+      <w:r>
+        <w:rPr>
+          <w:rFonts w:ascii="Calibri" w:hAnsi="Calibri" w:cs="Calibri"/>
+          <w:b/>
+          <w:bCs/>
+          <w:sz w:val="22"/>
+          <w:szCs w:val="22"/>
+        </w:rPr>
+        <w:t xml:space="preserve"> </w:t>
+      </w:r>
+      <w:r>
+        <w:rPr>
+          <w:rFonts w:ascii="Calibri" w:hAnsi="Calibri" w:cs="Calibri"/>
+          <w:sz w:val="22"/>
+          <w:szCs w:val="22"/>
+        </w:rPr>
+        <w:t>(same as phone)</w:t>
       </w:r>
     </w:p>
     <w:p>
@@ -256,7 +284,7 @@
           <w:sz w:val="22"/>
           <w:szCs w:val="22"/>
         </w:rPr>
-        <w:pict w14:anchorId="21DD3CE3">
+        <w:pict w14:anchorId="7C82E6E5">
           <v:rect id="_x0000_i1026" alt="" style="width:468pt;height:.05pt;mso-width-percent:0;mso-height-percent:0;mso-width-percent:0;mso-height-percent:0" o:hralign="center" o:hrstd="t" o:hr="t" fillcolor="#a0a0a0" stroked="f"/>
         </w:pict>
       </w:r>
@@ -529,7 +557,7 @@
           <w:sz w:val="22"/>
           <w:szCs w:val="22"/>
         </w:rPr>
-        <w:pict w14:anchorId="64BAB317">
+        <w:pict w14:anchorId="031DCFE9">
           <v:rect id="_x0000_i1025" alt="" style="width:468pt;height:.05pt;mso-width-percent:0;mso-height-percent:0;mso-width-percent:0;mso-height-percent:0" o:hralign="center" o:hrstd="t" o:hr="t" fillcolor="#a0a0a0" stroked="f"/>
         </w:pict>
       </w:r>
@@ -1309,7 +1337,7 @@
 </file>
 
 <file path=word/endnotes.xml><?xml version="1.0" encoding="utf-8"?>
-<w:endnotes xmlns:wpc="http://schemas.microsoft.com/office/word/2010/wordprocessingCanvas" xmlns:cx="http://schemas.microsoft.com/office/drawing/2014/chartex" xmlns:cx1="http://schemas.microsoft.com/office/drawing/2015/9/8/chartex" xmlns:cx2="http://schemas.microsoft.com/office/drawing/2015/10/21/chartex" xmlns:cx3="http://schemas.microsoft.com/office/drawing/2016/5/9/chartex" xmlns:cx4="http://schemas.microsoft.com/office/drawing/2016/5/10/chartex" xmlns:cx5="http://schemas.microsoft.com/office/drawing/2016/5/11/chartex" xmlns:cx6="http://schemas.microsoft.com/office/drawing/2016/5/12/chartex" xmlns:cx7="http://schemas.microsoft.com/office/drawing/2016/5/13/chartex" xmlns:cx8="http://schemas.microsoft.com/office/drawing/2016/5/14/chartex" xmlns:mc="http://schemas.openxmlformats.org/markup-compatibility/2006" xmlns:aink="http://schemas.microsoft.com/office/drawing/2016/ink" xmlns:am3d="http://schemas.microsoft.com/office/drawing/2017/model3d" xmlns:o="urn:schemas-microsoft-com:office:office" xmlns:oel="http://schemas.microsoft.com/office/2019/extlst" xmlns:r="http://schemas.openxmlformats.org/officeDocument/2006/relationships" xmlns:m="http://schemas.openxmlformats.org/officeDocument/2006/math" xmlns:v="urn:schemas-microsoft-com:vml" xmlns:wp14="http://schemas.microsoft.com/office/word/2010/wordprocessingDrawing" xmlns:wp="http://schemas.openxmlformats.org/drawingml/2006/wordprocessingDrawing" xmlns:w10="urn:schemas-microsoft-com:office:word" xmlns:w="http://schemas.openxmlformats.org/wordprocessingml/2006/main" xmlns:w14="http://schemas.microsoft.com/office/word/2010/wordml" xmlns:w15="http://schemas.microsoft.com/office/word/2012/wordml" xmlns:w16cex="http://schemas.microsoft.com/office/word/2018/wordml/cex" xmlns:w16cid="http://schemas.microsoft.com/office/word/2016/wordml/cid" xmlns:w16="http://schemas.microsoft.com/office/word/2018/wordml" xmlns:w16du="http://schemas.microsoft.com/office/word/2023/wordml/word16du" xmlns:w16sdtdh="http://schemas.microsoft.com/office/word/2020/wordml/sdtdatahash" xmlns:w16sdtfl="http://schemas.microsoft.com/office/word/2024/wordml/sdtformatlock" xmlns:w16se="http://schemas.microsoft.com/office/word/2015/wordml/symex" xmlns:wpg="http://schemas.microsoft.com/office/word/2010/wordprocessingGroup" xmlns:wpi="http://schemas.microsoft.com/office/word/2010/wordprocessingInk" xmlns:wne="http://schemas.microsoft.com/office/word/2006/wordml" xmlns:wps="http://schemas.microsoft.com/office/word/2010/wordprocessingShape" mc:Ignorable="w14 w15 w16se w16cid w16 w16cex w16sdtdh w16sdtfl w16du wp14">
+<w:endnotes xmlns:wpc="http://schemas.microsoft.com/office/word/2010/wordprocessingCanvas" xmlns:cx="http://schemas.microsoft.com/office/drawing/2014/chartex" xmlns:cx1="http://schemas.microsoft.com/office/drawing/2015/9/8/chartex" xmlns:cx2="http://schemas.microsoft.com/office/drawing/2015/10/21/chartex" xmlns:cx3="http://schemas.microsoft.com/office/drawing/2016/5/9/chartex" xmlns:cx4="http://schemas.microsoft.com/office/drawing/2016/5/10/chartex" xmlns:cx5="http://schemas.microsoft.com/office/drawing/2016/5/11/chartex" xmlns:cx6="http://schemas.microsoft.com/office/drawing/2016/5/12/chartex" xmlns:cx7="http://schemas.microsoft.com/office/drawing/2016/5/13/chartex" xmlns:cx8="http://schemas.microsoft.com/office/drawing/2016/5/14/chartex" xmlns:mc="http://schemas.openxmlformats.org/markup-compatibility/2006" xmlns:m="http://schemas.openxmlformats.org/officeDocument/2006/math" xmlns:aink="http://schemas.microsoft.com/office/drawing/2016/ink" xmlns:am3d="http://schemas.microsoft.com/office/drawing/2017/model3d" xmlns:oel="http://schemas.microsoft.com/office/2019/extlst" xmlns:r="http://schemas.openxmlformats.org/officeDocument/2006/relationships" xmlns:wp14="http://schemas.microsoft.com/office/word/2010/wordprocessingDrawing" xmlns:wp="http://schemas.openxmlformats.org/drawingml/2006/wordprocessingDrawing" xmlns:wpg="http://schemas.microsoft.com/office/word/2010/wordprocessingGroup" xmlns:wpi="http://schemas.microsoft.com/office/word/2010/wordprocessingInk" xmlns:wps="http://schemas.microsoft.com/office/word/2010/wordprocessingShape" xmlns:o="urn:schemas-microsoft-com:office:office" xmlns:v="urn:schemas-microsoft-com:vml" xmlns:w10="urn:schemas-microsoft-com:office:word" xmlns:w="http://schemas.openxmlformats.org/wordprocessingml/2006/main" xmlns:w14="http://schemas.microsoft.com/office/word/2010/wordml" xmlns:w15="http://schemas.microsoft.com/office/word/2012/wordml" xmlns:w16cex="http://schemas.microsoft.com/office/word/2018/wordml/cex" xmlns:w16cid="http://schemas.microsoft.com/office/word/2016/wordml/cid" xmlns:w16="http://schemas.microsoft.com/office/word/2018/wordml" xmlns:w16sdtdh="http://schemas.microsoft.com/office/word/2020/wordml/sdtdatahash" xmlns:w16sdtfl="http://schemas.microsoft.com/office/word/2024/wordml/sdtformatlock" xmlns:w16se="http://schemas.microsoft.com/office/word/2015/wordml/symex" xmlns:w16du="http://schemas.microsoft.com/office/word/2023/wordml/word16du" xmlns:wne="http://schemas.microsoft.com/office/word/2006/wordml" mc:Ignorable="w14 w15 w16se w16cid w16 w16cex w16sdtdh w16sdtfl w16du wp14">
   <w:endnote w:type="separator" w:id="-1">
     <w:p>
       <w:pPr>
@@ -1334,7 +1362,7 @@
 </file>
 
 <file path=word/footer1.xml><?xml version="1.0" encoding="utf-8"?>
-<w:ftr xmlns:wpc="http://schemas.microsoft.com/office/word/2010/wordprocessingCanvas" xmlns:cx="http://schemas.microsoft.com/office/drawing/2014/chartex" xmlns:cx1="http://schemas.microsoft.com/office/drawing/2015/9/8/chartex" xmlns:cx2="http://schemas.microsoft.com/office/drawing/2015/10/21/chartex" xmlns:cx3="http://schemas.microsoft.com/office/drawing/2016/5/9/chartex" xmlns:cx4="http://schemas.microsoft.com/office/drawing/2016/5/10/chartex" xmlns:cx5="http://schemas.microsoft.com/office/drawing/2016/5/11/chartex" xmlns:cx6="http://schemas.microsoft.com/office/drawing/2016/5/12/chartex" xmlns:cx7="http://schemas.microsoft.com/office/drawing/2016/5/13/chartex" xmlns:cx8="http://schemas.microsoft.com/office/drawing/2016/5/14/chartex" xmlns:mc="http://schemas.openxmlformats.org/markup-compatibility/2006" xmlns:aink="http://schemas.microsoft.com/office/drawing/2016/ink" xmlns:am3d="http://schemas.microsoft.com/office/drawing/2017/model3d" xmlns:o="urn:schemas-microsoft-com:office:office" xmlns:oel="http://schemas.microsoft.com/office/2019/extlst" xmlns:r="http://schemas.openxmlformats.org/officeDocument/2006/relationships" xmlns:m="http://schemas.openxmlformats.org/officeDocument/2006/math" xmlns:v="urn:schemas-microsoft-com:vml" xmlns:wp14="http://schemas.microsoft.com/office/word/2010/wordprocessingDrawing" xmlns:wp="http://schemas.openxmlformats.org/drawingml/2006/wordprocessingDrawing" xmlns:w10="urn:schemas-microsoft-com:office:word" xmlns:w="http://schemas.openxmlformats.org/wordprocessingml/2006/main" xmlns:w14="http://schemas.microsoft.com/office/word/2010/wordml" xmlns:w15="http://schemas.microsoft.com/office/word/2012/wordml" xmlns:w16cex="http://schemas.microsoft.com/office/word/2018/wordml/cex" xmlns:w16cid="http://schemas.microsoft.com/office/word/2016/wordml/cid" xmlns:w16="http://schemas.microsoft.com/office/word/2018/wordml" xmlns:w16du="http://schemas.microsoft.com/office/word/2023/wordml/word16du" xmlns:w16sdtdh="http://schemas.microsoft.com/office/word/2020/wordml/sdtdatahash" xmlns:w16sdtfl="http://schemas.microsoft.com/office/word/2024/wordml/sdtformatlock" xmlns:w16se="http://schemas.microsoft.com/office/word/2015/wordml/symex" xmlns:wpg="http://schemas.microsoft.com/office/word/2010/wordprocessingGroup" xmlns:wpi="http://schemas.microsoft.com/office/word/2010/wordprocessingInk" xmlns:wne="http://schemas.microsoft.com/office/word/2006/wordml" xmlns:wps="http://schemas.microsoft.com/office/word/2010/wordprocessingShape" mc:Ignorable="w14 w15 w16se w16cid w16 w16cex w16sdtdh w16sdtfl w16du wp14">
+<w:ftr xmlns:wpc="http://schemas.microsoft.com/office/word/2010/wordprocessingCanvas" xmlns:cx="http://schemas.microsoft.com/office/drawing/2014/chartex" xmlns:cx1="http://schemas.microsoft.com/office/drawing/2015/9/8/chartex" xmlns:cx2="http://schemas.microsoft.com/office/drawing/2015/10/21/chartex" xmlns:cx3="http://schemas.microsoft.com/office/drawing/2016/5/9/chartex" xmlns:cx4="http://schemas.microsoft.com/office/drawing/2016/5/10/chartex" xmlns:cx5="http://schemas.microsoft.com/office/drawing/2016/5/11/chartex" xmlns:cx6="http://schemas.microsoft.com/office/drawing/2016/5/12/chartex" xmlns:cx7="http://schemas.microsoft.com/office/drawing/2016/5/13/chartex" xmlns:cx8="http://schemas.microsoft.com/office/drawing/2016/5/14/chartex" xmlns:mc="http://schemas.openxmlformats.org/markup-compatibility/2006" xmlns:m="http://schemas.openxmlformats.org/officeDocument/2006/math" xmlns:aink="http://schemas.microsoft.com/office/drawing/2016/ink" xmlns:am3d="http://schemas.microsoft.com/office/drawing/2017/model3d" xmlns:oel="http://schemas.microsoft.com/office/2019/extlst" xmlns:r="http://schemas.openxmlformats.org/officeDocument/2006/relationships" xmlns:wp14="http://schemas.microsoft.com/office/word/2010/wordprocessingDrawing" xmlns:wp="http://schemas.openxmlformats.org/drawingml/2006/wordprocessingDrawing" xmlns:wpg="http://schemas.microsoft.com/office/word/2010/wordprocessingGroup" xmlns:wpi="http://schemas.microsoft.com/office/word/2010/wordprocessingInk" xmlns:wps="http://schemas.microsoft.com/office/word/2010/wordprocessingShape" xmlns:o="urn:schemas-microsoft-com:office:office" xmlns:v="urn:schemas-microsoft-com:vml" xmlns:w10="urn:schemas-microsoft-com:office:word" xmlns:w="http://schemas.openxmlformats.org/wordprocessingml/2006/main" xmlns:w14="http://schemas.microsoft.com/office/word/2010/wordml" xmlns:w15="http://schemas.microsoft.com/office/word/2012/wordml" xmlns:w16cex="http://schemas.microsoft.com/office/word/2018/wordml/cex" xmlns:w16cid="http://schemas.microsoft.com/office/word/2016/wordml/cid" xmlns:w16="http://schemas.microsoft.com/office/word/2018/wordml" xmlns:w16sdtdh="http://schemas.microsoft.com/office/word/2020/wordml/sdtdatahash" xmlns:w16sdtfl="http://schemas.microsoft.com/office/word/2024/wordml/sdtformatlock" xmlns:w16se="http://schemas.microsoft.com/office/word/2015/wordml/symex" xmlns:w16du="http://schemas.microsoft.com/office/word/2023/wordml/word16du" xmlns:wne="http://schemas.microsoft.com/office/word/2006/wordml" mc:Ignorable="w14 w15 w16se w16cid w16 w16cex w16sdtdh w16sdtfl w16du wp14">
   <w:p>
     <w:pPr>
       <w:pStyle w:val="Footer"/>
@@ -1343,13 +1371,16 @@
       <w:t>202</w:t>
     </w:r>
     <w:r>
-      <w:t xml:space="preserve">60513 </w:t>
+      <w:t>6</w:t>
     </w:r>
     <w:r>
-      <w:t>v</w:t>
+      <w:t>-</w:t>
     </w:r>
     <w:r>
-      <w:t>2</w:t>
+      <w:t>0</w:t>
+    </w:r>
+    <w:r>
+      <w:t>7-03</w:t>
     </w:r>
     <w:r>
       <w:tab/>
@@ -1387,7 +1418,7 @@
 </file>
 
 <file path=word/footnotes.xml><?xml version="1.0" encoding="utf-8"?>
-<w:footnotes xmlns:wpc="http://schemas.microsoft.com/office/word/2010/wordprocessingCanvas" xmlns:cx="http://schemas.microsoft.com/office/drawing/2014/chartex" xmlns:cx1="http://schemas.microsoft.com/office/drawing/2015/9/8/chartex" xmlns:cx2="http://schemas.microsoft.com/office/drawing/2015/10/21/chartex" xmlns:cx3="http://schemas.microsoft.com/office/drawing/2016/5/9/chartex" xmlns:cx4="http://schemas.microsoft.com/office/drawing/2016/5/10/chartex" xmlns:cx5="http://schemas.microsoft.com/office/drawing/2016/5/11/chartex" xmlns:cx6="http://schemas.microsoft.com/office/drawing/2016/5/12/chartex" xmlns:cx7="http://schemas.microsoft.com/office/drawing/2016/5/13/chartex" xmlns:cx8="http://schemas.microsoft.com/office/drawing/2016/5/14/chartex" xmlns:mc="http://schemas.openxmlformats.org/markup-compatibility/2006" xmlns:aink="http://schemas.microsoft.com/office/drawing/2016/ink" xmlns:am3d="http://schemas.microsoft.com/office/drawing/2017/model3d" xmlns:o="urn:schemas-microsoft-com:office:office" xmlns:oel="http://schemas.microsoft.com/office/2019/extlst" xmlns:r="http://schemas.openxmlformats.org/officeDocument/2006/relationships" xmlns:m="http://schemas.openxmlformats.org/officeDocument/2006/math" xmlns:v="urn:schemas-microsoft-com:vml" xmlns:wp14="http://schemas.microsoft.com/office/word/2010/wordprocessingDrawing" xmlns:wp="http://schemas.openxmlformats.org/drawingml/2006/wordprocessingDrawing" xmlns:w10="urn:schemas-microsoft-com:office:word" xmlns:w="http://schemas.openxmlformats.org/wordprocessingml/2006/main" xmlns:w14="http://schemas.microsoft.com/office/word/2010/wordml" xmlns:w15="http://schemas.microsoft.com/office/word/2012/wordml" xmlns:w16cex="http://schemas.microsoft.com/office/word/2018/wordml/cex" xmlns:w16cid="http://schemas.microsoft.com/office/word/2016/wordml/cid" xmlns:w16="http://schemas.microsoft.com/office/word/2018/wordml" xmlns:w16du="http://schemas.microsoft.com/office/word/2023/wordml/word16du" xmlns:w16sdtdh="http://schemas.microsoft.com/office/word/2020/wordml/sdtdatahash" xmlns:w16sdtfl="http://schemas.microsoft.com/office/word/2024/wordml/sdtformatlock" xmlns:w16se="http://schemas.microsoft.com/office/word/2015/wordml/symex" xmlns:wpg="http://schemas.microsoft.com/office/word/2010/wordprocessingGroup" xmlns:wpi="http://schemas.microsoft.com/office/word/2010/wordprocessingInk" xmlns:wne="http://schemas.microsoft.com/office/word/2006/wordml" xmlns:wps="http://schemas.microsoft.com/office/word/2010/wordprocessingShape" mc:Ignorable="w14 w15 w16se w16cid w16 w16cex w16sdtdh w16sdtfl w16du wp14">
+<w:footnotes xmlns:wpc="http://schemas.microsoft.com/office/word/2010/wordprocessingCanvas" xmlns:cx="http://schemas.microsoft.com/office/drawing/2014/chartex" xmlns:cx1="http://schemas.microsoft.com/office/drawing/2015/9/8/chartex" xmlns:cx2="http://schemas.microsoft.com/office/drawing/2015/10/21/chartex" xmlns:cx3="http://schemas.microsoft.com/office/drawing/2016/5/9/chartex" xmlns:cx4="http://schemas.microsoft.com/office/drawing/2016/5/10/chartex" xmlns:cx5="http://schemas.microsoft.com/office/drawing/2016/5/11/chartex" xmlns:cx6="http://schemas.microsoft.com/office/drawing/2016/5/12/chartex" xmlns:cx7="http://schemas.microsoft.com/office/drawing/2016/5/13/chartex" xmlns:cx8="http://schemas.microsoft.com/office/drawing/2016/5/14/chartex" xmlns:mc="http://schemas.openxmlformats.org/markup-compatibility/2006" xmlns:m="http://schemas.openxmlformats.org/officeDocument/2006/math" xmlns:aink="http://schemas.microsoft.com/office/drawing/2016/ink" xmlns:am3d="http://schemas.microsoft.com/office/drawing/2017/model3d" xmlns:oel="http://schemas.microsoft.com/office/2019/extlst" xmlns:r="http://schemas.openxmlformats.org/officeDocument/2006/relationships" xmlns:wp14="http://schemas.microsoft.com/office/word/2010/wordprocessingDrawing" xmlns:wp="http://schemas.openxmlformats.org/drawingml/2006/wordprocessingDrawing" xmlns:wpg="http://schemas.microsoft.com/office/word/2010/wordprocessingGroup" xmlns:wpi="http://schemas.microsoft.com/office/word/2010/wordprocessingInk" xmlns:wps="http://schemas.microsoft.com/office/word/2010/wordprocessingShape" xmlns:o="urn:schemas-microsoft-com:office:office" xmlns:v="urn:schemas-microsoft-com:vml" xmlns:w10="urn:schemas-microsoft-com:office:word" xmlns:w="http://schemas.openxmlformats.org/wordprocessingml/2006/main" xmlns:w14="http://schemas.microsoft.com/office/word/2010/wordml" xmlns:w15="http://schemas.microsoft.com/office/word/2012/wordml" xmlns:w16cex="http://schemas.microsoft.com/office/word/2018/wordml/cex" xmlns:w16cid="http://schemas.microsoft.com/office/word/2016/wordml/cid" xmlns:w16="http://schemas.microsoft.com/office/word/2018/wordml" xmlns:w16sdtdh="http://schemas.microsoft.com/office/word/2020/wordml/sdtdatahash" xmlns:w16sdtfl="http://schemas.microsoft.com/office/word/2024/wordml/sdtformatlock" xmlns:w16se="http://schemas.microsoft.com/office/word/2015/wordml/symex" xmlns:w16du="http://schemas.microsoft.com/office/word/2023/wordml/word16du" xmlns:wne="http://schemas.microsoft.com/office/word/2006/wordml" mc:Ignorable="w14 w15 w16se w16cid w16 w16cex w16sdtdh w16sdtfl w16du wp14">
   <w:footnote w:type="separator" w:id="-1">
     <w:p>
       <w:pPr>
@@ -1412,7 +1443,7 @@
 </file>
 
 <file path=word/numbering.xml><?xml version="1.0" encoding="utf-8"?>
-<w:numbering xmlns:wpc="http://schemas.microsoft.com/office/word/2010/wordprocessingCanvas" xmlns:cx="http://schemas.microsoft.com/office/drawing/2014/chartex" xmlns:cx1="http://schemas.microsoft.com/office/drawing/2015/9/8/chartex" xmlns:cx2="http://schemas.microsoft.com/office/drawing/2015/10/21/chartex" xmlns:cx3="http://schemas.microsoft.com/office/drawing/2016/5/9/chartex" xmlns:cx4="http://schemas.microsoft.com/office/drawing/2016/5/10/chartex" xmlns:cx5="http://schemas.microsoft.com/office/drawing/2016/5/11/chartex" xmlns:cx6="http://schemas.microsoft.com/office/drawing/2016/5/12/chartex" xmlns:cx7="http://schemas.microsoft.com/office/drawing/2016/5/13/chartex" xmlns:cx8="http://schemas.microsoft.com/office/drawing/2016/5/14/chartex" xmlns:mc="http://schemas.openxmlformats.org/markup-compatibility/2006" xmlns:aink="http://schemas.microsoft.com/office/drawing/2016/ink" xmlns:am3d="http://schemas.microsoft.com/office/drawing/2017/model3d" xmlns:o="urn:schemas-microsoft-com:office:office" xmlns:oel="http://schemas.microsoft.com/office/2019/extlst" xmlns:r="http://schemas.openxmlformats.org/officeDocument/2006/relationships" xmlns:m="http://schemas.openxmlformats.org/officeDocument/2006/math" xmlns:v="urn:schemas-microsoft-com:vml" xmlns:wp14="http://schemas.microsoft.com/office/word/2010/wordprocessingDrawing" xmlns:wp="http://schemas.openxmlformats.org/drawingml/2006/wordprocessingDrawing" xmlns:w10="urn:schemas-microsoft-com:office:word" xmlns:w="http://schemas.openxmlformats.org/wordprocessingml/2006/main" xmlns:w14="http://schemas.microsoft.com/office/word/2010/wordml" xmlns:w15="http://schemas.microsoft.com/office/word/2012/wordml" xmlns:w16cex="http://schemas.microsoft.com/office/word/2018/wordml/cex" xmlns:w16cid="http://schemas.microsoft.com/office/word/2016/wordml/cid" xmlns:w16="http://schemas.microsoft.com/office/word/2018/wordml" xmlns:w16du="http://schemas.microsoft.com/office/word/2023/wordml/word16du" xmlns:w16sdtdh="http://schemas.microsoft.com/office/word/2020/wordml/sdtdatahash" xmlns:w16sdtfl="http://schemas.microsoft.com/office/word/2024/wordml/sdtformatlock" xmlns:w16se="http://schemas.microsoft.com/office/word/2015/wordml/symex" xmlns:wpg="http://schemas.microsoft.com/office/word/2010/wordprocessingGroup" xmlns:wpi="http://schemas.microsoft.com/office/word/2010/wordprocessingInk" xmlns:wne="http://schemas.microsoft.com/office/word/2006/wordml" xmlns:wps="http://schemas.microsoft.com/office/word/2010/wordprocessingShape" mc:Ignorable="w14 w15 w16se w16cid w16 w16cex w16sdtdh w16sdtfl w16du wp14">
+<w:numbering xmlns:wpc="http://schemas.microsoft.com/office/word/2010/wordprocessingCanvas" xmlns:cx="http://schemas.microsoft.com/office/drawing/2014/chartex" xmlns:cx1="http://schemas.microsoft.com/office/drawing/2015/9/8/chartex" xmlns:cx2="http://schemas.microsoft.com/office/drawing/2015/10/21/chartex" xmlns:cx3="http://schemas.microsoft.com/office/drawing/2016/5/9/chartex" xmlns:cx4="http://schemas.microsoft.com/office/drawing/2016/5/10/chartex" xmlns:cx5="http://schemas.microsoft.com/office/drawing/2016/5/11/chartex" xmlns:cx6="http://schemas.microsoft.com/office/drawing/2016/5/12/chartex" xmlns:cx7="http://schemas.microsoft.com/office/drawing/2016/5/13/chartex" xmlns:cx8="http://schemas.microsoft.com/office/drawing/2016/5/14/chartex" xmlns:mc="http://schemas.openxmlformats.org/markup-compatibility/2006" xmlns:m="http://schemas.openxmlformats.org/officeDocument/2006/math" xmlns:aink="http://schemas.microsoft.com/office/drawing/2016/ink" xmlns:am3d="http://schemas.microsoft.com/office/drawing/2017/model3d" xmlns:oel="http://schemas.microsoft.com/office/2019/extlst" xmlns:r="http://schemas.openxmlformats.org/officeDocument/2006/relationships" xmlns:wp14="http://schemas.microsoft.com/office/word/2010/wordprocessingDrawing" xmlns:wp="http://schemas.openxmlformats.org/drawingml/2006/wordprocessingDrawing" xmlns:wpg="http://schemas.microsoft.com/office/word/2010/wordprocessingGroup" xmlns:wpi="http://schemas.microsoft.com/office/word/2010/wordprocessingInk" xmlns:wps="http://schemas.microsoft.com/office/word/2010/wordprocessingShape" xmlns:o="urn:schemas-microsoft-com:office:office" xmlns:v="urn:schemas-microsoft-com:vml" xmlns:w10="urn:schemas-microsoft-com:office:word" xmlns:w="http://schemas.openxmlformats.org/wordprocessingml/2006/main" xmlns:w14="http://schemas.microsoft.com/office/word/2010/wordml" xmlns:w15="http://schemas.microsoft.com/office/word/2012/wordml" xmlns:w16cex="http://schemas.microsoft.com/office/word/2018/wordml/cex" xmlns:w16cid="http://schemas.microsoft.com/office/word/2016/wordml/cid" xmlns:w16="http://schemas.microsoft.com/office/word/2018/wordml" xmlns:w16sdtdh="http://schemas.microsoft.com/office/word/2020/wordml/sdtdatahash" xmlns:w16sdtfl="http://schemas.microsoft.com/office/word/2024/wordml/sdtformatlock" xmlns:w16se="http://schemas.microsoft.com/office/word/2015/wordml/symex" xmlns:w16du="http://schemas.microsoft.com/office/word/2023/wordml/word16du" xmlns:wne="http://schemas.microsoft.com/office/word/2006/wordml" mc:Ignorable="w14 w15 w16se w16cid w16 w16cex w16sdtdh w16sdtfl w16du wp14">
   <w:abstractNum w:abstractNumId="0" w15:restartNumberingAfterBreak="0">
     <w:nsid w:val="172E6F62"/>
     <w:multiLevelType w:val="hybridMultilevel"/>
@@ -1988,7 +2019,7 @@
 </file>
 
 <file path=word/styles.xml><?xml version="1.0" encoding="utf-8"?>
-<w:styles xmlns:mc="http://schemas.openxmlformats.org/markup-compatibility/2006" xmlns:r="http://schemas.openxmlformats.org/officeDocument/2006/relationships" xmlns:w="http://schemas.openxmlformats.org/wordprocessingml/2006/main" xmlns:w14="http://schemas.microsoft.com/office/word/2010/wordml" xmlns:w15="http://schemas.microsoft.com/office/word/2012/wordml" xmlns:w16cex="http://schemas.microsoft.com/office/word/2018/wordml/cex" xmlns:w16cid="http://schemas.microsoft.com/office/word/2016/wordml/cid" xmlns:w16="http://schemas.microsoft.com/office/word/2018/wordml" xmlns:w16du="http://schemas.microsoft.com/office/word/2023/wordml/word16du" xmlns:w16sdtdh="http://schemas.microsoft.com/office/word/2020/wordml/sdtdatahash" xmlns:w16sdtfl="http://schemas.microsoft.com/office/word/2024/wordml/sdtformatlock" xmlns:w16se="http://schemas.microsoft.com/office/word/2015/wordml/symex" mc:Ignorable="w14 w15 w16se w16cid w16 w16cex w16sdtdh w16sdtfl w16du">
+<w:styles xmlns:mc="http://schemas.openxmlformats.org/markup-compatibility/2006" xmlns:r="http://schemas.openxmlformats.org/officeDocument/2006/relationships" xmlns:w="http://schemas.openxmlformats.org/wordprocessingml/2006/main" xmlns:w14="http://schemas.microsoft.com/office/word/2010/wordml" xmlns:w15="http://schemas.microsoft.com/office/word/2012/wordml" xmlns:w16cex="http://schemas.microsoft.com/office/word/2018/wordml/cex" xmlns:w16cid="http://schemas.microsoft.com/office/word/2016/wordml/cid" xmlns:w16="http://schemas.microsoft.com/office/word/2018/wordml" xmlns:w16sdtdh="http://schemas.microsoft.com/office/word/2020/wordml/sdtdatahash" xmlns:w16sdtfl="http://schemas.microsoft.com/office/word/2024/wordml/sdtformatlock" xmlns:w16se="http://schemas.microsoft.com/office/word/2015/wordml/symex" xmlns:w16du="http://schemas.microsoft.com/office/word/2023/wordml/word16du" mc:Ignorable="w14 w15 w16se w16cid w16 w16cex w16sdtdh w16sdtfl w16du">
   <w:docDefaults>
     <w:rPrDefault>
       <w:rPr>

</xml_diff>

<commit_message>
Update referral form PDF and Word doc
Co-Authored-By: Claude Sonnet 5 <noreply@anthropic.com>
</commit_message>
<xml_diff>
--- a/assets/files/referral-form.docx
+++ b/assets/files/referral-form.docx
@@ -22,22 +22,22 @@
           <w:szCs w:val="32"/>
         </w:rPr>
         <w:drawing>
-          <wp:anchor distT="0" distB="0" distL="114300" distR="114300" simplePos="0" relativeHeight="251658240" behindDoc="1" locked="0" layoutInCell="1" allowOverlap="1" wp14:anchorId="377F9A89" wp14:editId="467C0169">
+          <wp:anchor distT="0" distB="0" distL="114300" distR="114300" simplePos="0" relativeHeight="251658240" behindDoc="1" locked="0" layoutInCell="1" allowOverlap="1" wp14:anchorId="377F9A89" wp14:editId="00DD642F">
             <wp:simplePos x="0" y="0"/>
             <wp:positionH relativeFrom="column">
-              <wp:posOffset>4995511</wp:posOffset>
+              <wp:posOffset>5283027</wp:posOffset>
             </wp:positionH>
             <wp:positionV relativeFrom="paragraph">
-              <wp:posOffset>435</wp:posOffset>
+              <wp:posOffset>0</wp:posOffset>
             </wp:positionV>
-            <wp:extent cx="838200" cy="584200"/>
-            <wp:effectExtent l="0" t="0" r="0" b="0"/>
+            <wp:extent cx="597535" cy="416560"/>
+            <wp:effectExtent l="0" t="0" r="0" b="2540"/>
             <wp:wrapTight wrapText="bothSides">
               <wp:wrapPolygon edited="0">
                 <wp:start x="0" y="0"/>
-                <wp:lineTo x="0" y="21130"/>
-                <wp:lineTo x="21273" y="21130"/>
-                <wp:lineTo x="21273" y="0"/>
+                <wp:lineTo x="0" y="21073"/>
+                <wp:lineTo x="21118" y="21073"/>
+                <wp:lineTo x="21118" y="0"/>
                 <wp:lineTo x="0" y="0"/>
               </wp:wrapPolygon>
             </wp:wrapTight>
@@ -67,7 +67,7 @@
                   <pic:spPr>
                     <a:xfrm>
                       <a:off x="0" y="0"/>
-                      <a:ext cx="838200" cy="584200"/>
+                      <a:ext cx="597535" cy="416560"/>
                     </a:xfrm>
                     <a:prstGeom prst="rect">
                       <a:avLst/>
@@ -115,7 +115,7 @@
           <w:sz w:val="22"/>
           <w:szCs w:val="22"/>
         </w:rPr>
-        <w:t>Fax</w:t>
+        <w:t>Phone / Fax</w:t>
       </w:r>
       <w:r>
         <w:rPr>
@@ -161,35 +161,67 @@
           <w:sz w:val="22"/>
           <w:szCs w:val="22"/>
         </w:rPr>
-        <w:t xml:space="preserve"> </w:t>
-      </w:r>
-      <w:r>
-        <w:rPr>
-          <w:rFonts w:ascii="Calibri" w:hAnsi="Calibri" w:cs="Calibri"/>
-          <w:sz w:val="22"/>
-          <w:szCs w:val="22"/>
-        </w:rPr>
-        <w:t>(same as phone)</w:t>
+        <w:t xml:space="preserve"> (</w:t>
+      </w:r>
+      <w:r>
+        <w:rPr>
+          <w:rFonts w:ascii="Calibri" w:hAnsi="Calibri" w:cs="Calibri"/>
+          <w:sz w:val="22"/>
+          <w:szCs w:val="22"/>
+        </w:rPr>
+        <w:t>same</w:t>
+      </w:r>
+      <w:r>
+        <w:rPr>
+          <w:rFonts w:ascii="Calibri" w:hAnsi="Calibri" w:cs="Calibri"/>
+          <w:sz w:val="22"/>
+          <w:szCs w:val="22"/>
+        </w:rPr>
+        <w:t xml:space="preserve"> number</w:t>
+      </w:r>
+      <w:r>
+        <w:rPr>
+          <w:rFonts w:ascii="Calibri" w:hAnsi="Calibri" w:cs="Calibri"/>
+          <w:sz w:val="22"/>
+          <w:szCs w:val="22"/>
+        </w:rPr>
+        <w:t>)</w:t>
       </w:r>
     </w:p>
     <w:p>
       <w:pPr>
-        <w:tabs>
-          <w:tab w:val="left" w:pos="2127"/>
-        </w:tabs>
-        <w:rPr>
-          <w:rFonts w:ascii="Calibri" w:hAnsi="Calibri" w:cs="Calibri"/>
-          <w:sz w:val="22"/>
-          <w:szCs w:val="22"/>
-        </w:rPr>
-      </w:pPr>
-      <w:r>
-        <w:rPr>
-          <w:rFonts w:ascii="Calibri" w:hAnsi="Calibri" w:cs="Calibri"/>
-          <w:sz w:val="22"/>
-          <w:szCs w:val="22"/>
-        </w:rPr>
-        <w:t xml:space="preserve">Phone: </w:t>
+        <w:ind w:left="2127" w:hanging="2127"/>
+        <w:rPr>
+          <w:rFonts w:ascii="Calibri" w:hAnsi="Calibri" w:cs="Calibri"/>
+          <w:i/>
+          <w:iCs/>
+          <w:sz w:val="22"/>
+          <w:szCs w:val="22"/>
+        </w:rPr>
+      </w:pPr>
+      <w:r>
+        <w:rPr>
+          <w:rFonts w:ascii="Calibri" w:hAnsi="Calibri" w:cs="Calibri"/>
+          <w:sz w:val="22"/>
+          <w:szCs w:val="22"/>
+        </w:rPr>
+        <w:t>E</w:t>
+      </w:r>
+      <w:r>
+        <w:rPr>
+          <w:rFonts w:ascii="Calibri" w:hAnsi="Calibri" w:cs="Calibri"/>
+          <w:sz w:val="22"/>
+          <w:szCs w:val="22"/>
+        </w:rPr>
+        <w:t>mail</w:t>
+      </w:r>
+      <w:r>
+        <w:rPr>
+          <w:rFonts w:ascii="Calibri" w:hAnsi="Calibri" w:cs="Calibri"/>
+          <w:sz w:val="22"/>
+          <w:szCs w:val="22"/>
+        </w:rPr>
+        <w:t xml:space="preserve">: </w:t>
       </w:r>
       <w:r>
         <w:rPr>
@@ -198,79 +230,34 @@
           <w:szCs w:val="22"/>
         </w:rPr>
         <w:tab/>
-        <w:t>(236) 501 5099</w:t>
+      </w:r>
+      <w:r>
+        <w:rPr>
+          <w:rFonts w:ascii="Calibri" w:hAnsi="Calibri" w:cs="Calibri"/>
+          <w:sz w:val="22"/>
+          <w:szCs w:val="22"/>
+        </w:rPr>
+        <w:t>clinic</w:t>
+      </w:r>
+      <w:r>
+        <w:rPr>
+          <w:rFonts w:ascii="Calibri" w:hAnsi="Calibri" w:cs="Calibri"/>
+          <w:sz w:val="22"/>
+          <w:szCs w:val="22"/>
+        </w:rPr>
+        <w:t>@sparrow.clinic</w:t>
+      </w:r>
+      <w:r>
+        <w:rPr>
+          <w:rFonts w:ascii="Calibri" w:hAnsi="Calibri" w:cs="Calibri"/>
+          <w:sz w:val="22"/>
+          <w:szCs w:val="22"/>
+        </w:rPr>
+        <w:t xml:space="preserve"> </w:t>
       </w:r>
     </w:p>
     <w:p>
       <w:pPr>
-        <w:ind w:left="2127" w:hanging="2127"/>
-        <w:rPr>
-          <w:rFonts w:ascii="Calibri" w:hAnsi="Calibri" w:cs="Calibri"/>
-          <w:i/>
-          <w:iCs/>
-          <w:sz w:val="22"/>
-          <w:szCs w:val="22"/>
-        </w:rPr>
-      </w:pPr>
-      <w:r>
-        <w:rPr>
-          <w:rFonts w:ascii="Calibri" w:hAnsi="Calibri" w:cs="Calibri"/>
-          <w:sz w:val="22"/>
-          <w:szCs w:val="22"/>
-        </w:rPr>
-        <w:t>E</w:t>
-      </w:r>
-      <w:r>
-        <w:rPr>
-          <w:rFonts w:ascii="Calibri" w:hAnsi="Calibri" w:cs="Calibri"/>
-          <w:sz w:val="22"/>
-          <w:szCs w:val="22"/>
-        </w:rPr>
-        <w:t>mail</w:t>
-      </w:r>
-      <w:r>
-        <w:rPr>
-          <w:rFonts w:ascii="Calibri" w:hAnsi="Calibri" w:cs="Calibri"/>
-          <w:sz w:val="22"/>
-          <w:szCs w:val="22"/>
-        </w:rPr>
-        <w:t xml:space="preserve">: </w:t>
-      </w:r>
-      <w:r>
-        <w:rPr>
-          <w:rFonts w:ascii="Calibri" w:hAnsi="Calibri" w:cs="Calibri"/>
-          <w:sz w:val="22"/>
-          <w:szCs w:val="22"/>
-        </w:rPr>
-        <w:tab/>
-      </w:r>
-      <w:r>
-        <w:rPr>
-          <w:rFonts w:ascii="Calibri" w:hAnsi="Calibri" w:cs="Calibri"/>
-          <w:sz w:val="22"/>
-          <w:szCs w:val="22"/>
-        </w:rPr>
-        <w:t>clinic</w:t>
-      </w:r>
-      <w:r>
-        <w:rPr>
-          <w:rFonts w:ascii="Calibri" w:hAnsi="Calibri" w:cs="Calibri"/>
-          <w:sz w:val="22"/>
-          <w:szCs w:val="22"/>
-        </w:rPr>
-        <w:t>@sparrow.clinic</w:t>
-      </w:r>
-      <w:r>
-        <w:rPr>
-          <w:rFonts w:ascii="Calibri" w:hAnsi="Calibri" w:cs="Calibri"/>
-          <w:sz w:val="22"/>
-          <w:szCs w:val="22"/>
-        </w:rPr>
-        <w:t xml:space="preserve"> </w:t>
-      </w:r>
-    </w:p>
-    <w:p>
-      <w:pPr>
         <w:rPr>
           <w:rFonts w:ascii="Calibri" w:hAnsi="Calibri" w:cs="Calibri"/>
           <w:sz w:val="22"/>
@@ -284,7 +271,7 @@
           <w:sz w:val="22"/>
           <w:szCs w:val="22"/>
         </w:rPr>
-        <w:pict w14:anchorId="7C82E6E5">
+        <w:pict w14:anchorId="542B17A6">
           <v:rect id="_x0000_i1026" alt="" style="width:468pt;height:.05pt;mso-width-percent:0;mso-height-percent:0;mso-width-percent:0;mso-height-percent:0" o:hralign="center" o:hrstd="t" o:hr="t" fillcolor="#a0a0a0" stroked="f"/>
         </w:pict>
       </w:r>
@@ -544,6 +531,72 @@
     </w:p>
     <w:p>
       <w:pPr>
+        <w:spacing w:line="480" w:lineRule="auto"/>
+        <w:rPr>
+          <w:rFonts w:ascii="Calibri" w:hAnsi="Calibri" w:cs="Calibri"/>
+          <w:sz w:val="22"/>
+          <w:szCs w:val="22"/>
+        </w:rPr>
+      </w:pPr>
+      <w:r>
+        <w:rPr>
+          <w:rFonts w:ascii="Calibri" w:hAnsi="Calibri" w:cs="Calibri"/>
+          <w:sz w:val="22"/>
+          <w:szCs w:val="22"/>
+        </w:rPr>
+        <w:t>Email</w:t>
+      </w:r>
+      <w:r>
+        <w:rPr>
+          <w:rFonts w:ascii="Calibri" w:hAnsi="Calibri" w:cs="Calibri"/>
+          <w:sz w:val="22"/>
+          <w:szCs w:val="22"/>
+        </w:rPr>
+        <w:t>–</w:t>
+      </w:r>
+      <w:r>
+        <w:rPr>
+          <w:rFonts w:ascii="Calibri" w:hAnsi="Calibri" w:cs="Calibri"/>
+          <w:sz w:val="22"/>
+          <w:szCs w:val="22"/>
+        </w:rPr>
+        <w:t>to confirm referral received</w:t>
+      </w:r>
+      <w:r>
+        <w:rPr>
+          <w:rFonts w:ascii="Calibri" w:hAnsi="Calibri" w:cs="Calibri"/>
+          <w:sz w:val="22"/>
+          <w:szCs w:val="22"/>
+        </w:rPr>
+        <w:t>:</w:t>
+      </w:r>
+      <w:r>
+        <w:rPr>
+          <w:rFonts w:ascii="Calibri" w:hAnsi="Calibri" w:cs="Calibri"/>
+          <w:sz w:val="22"/>
+          <w:szCs w:val="22"/>
+        </w:rPr>
+        <w:t xml:space="preserve">  </w:t>
+      </w:r>
+      <w:r>
+        <w:rPr>
+          <w:rFonts w:ascii="Calibri" w:hAnsi="Calibri" w:cs="Calibri"/>
+          <w:sz w:val="22"/>
+          <w:szCs w:val="22"/>
+        </w:rPr>
+        <w:t>_</w:t>
+      </w:r>
+      <w:r>
+        <w:rPr>
+          <w:rFonts w:ascii="Calibri" w:hAnsi="Calibri" w:cs="Calibri"/>
+          <w:sz w:val="22"/>
+          <w:szCs w:val="22"/>
+        </w:rPr>
+        <w:t>______________________________________________________</w:t>
+      </w:r>
+    </w:p>
+    <w:p>
+      <w:pPr>
         <w:rPr>
           <w:rFonts w:ascii="Calibri" w:hAnsi="Calibri" w:cs="Calibri"/>
           <w:sz w:val="22"/>
@@ -557,7 +610,7 @@
           <w:sz w:val="22"/>
           <w:szCs w:val="22"/>
         </w:rPr>
-        <w:pict w14:anchorId="031DCFE9">
+        <w:pict w14:anchorId="6DB06461">
           <v:rect id="_x0000_i1025" alt="" style="width:468pt;height:.05pt;mso-width-percent:0;mso-height-percent:0;mso-width-percent:0;mso-height-percent:0" o:hralign="center" o:hrstd="t" o:hr="t" fillcolor="#a0a0a0" stroked="f"/>
         </w:pict>
       </w:r>
@@ -1328,7 +1381,7 @@
       <w:footerReference w:type="default" r:id="rId8"/>
       <w:type w:val="continuous"/>
       <w:pgSz w:w="12240" w:h="15840"/>
-      <w:pgMar w:top="1440" w:right="1440" w:bottom="1440" w:left="1440" w:header="708" w:footer="708" w:gutter="0"/>
+      <w:pgMar w:top="1076" w:right="1440" w:bottom="1249" w:left="1440" w:header="708" w:footer="708" w:gutter="0"/>
       <w:cols w:space="708"/>
       <w:docGrid w:linePitch="360"/>
     </w:sectPr>
@@ -1380,7 +1433,10 @@
       <w:t>0</w:t>
     </w:r>
     <w:r>
-      <w:t>7-03</w:t>
+      <w:t>7-</w:t>
+    </w:r>
+    <w:r>
+      <w:t>15</w:t>
     </w:r>
     <w:r>
       <w:tab/>

</xml_diff>